<commit_message>
Doku: veraltete Schaltplaene (v1/v2) + Generatoren entfernt
- git rm: Schaltplan_Hoftor_v1.pdf, Schaltplan_Hoftor_v2_KlemmenRelais.pdf,
  Schaltplan_v2_preview.png, make_schaltplan.py, make_schaltplan_v2.py
  (ueberholt + qualitativ unzureichend)
- alle Verweise bereinigt (CLAUDE.md §6a/§8/§10, aderfarben, Verdrahtungs-Doku)
- Verdrahtungs-Doku docx regeneriert
- massgebliche Verdrahtungs-Referenz = Belegungsplan §6a / Hoftor_Verdrahtung_v1

Co-Authored-By: Claude Opus 4.8 <noreply@anthropic.com>
</commit_message>
<xml_diff>
--- a/Hoftor_Verdrahtung_v1.docx
+++ b/Hoftor_Verdrahtung_v1.docx
@@ -551,7 +551,7 @@
         <w:t xml:space="preserve"> </w:t>
       </w:r>
       <w:r>
-        <w:t xml:space="preserve">bleiben als logischer Bezug für Firmware-Code + Schaltplan erhalten und sind in den Tabellen in Klammern angegeben.</w:t>
+        <w:t xml:space="preserve">bleiben als logischer Bezug für den Firmware-Code erhalten und sind in den Tabellen in Klammern angegeben.</w:t>
       </w:r>
     </w:p>
     <w:bookmarkEnd w:id="10"/>
@@ -4847,7 +4847,7 @@
           <w:b/>
           <w:bCs/>
         </w:rPr>
-        <w:t xml:space="preserve">Schaltplan (zu aktualisieren):</w:t>
+        <w:t xml:space="preserve">BFT-Handbuch:</w:t>
       </w:r>
       <w:r>
         <w:t xml:space="preserve"> </w:t>
@@ -4856,13 +4856,13 @@
         <w:rPr>
           <w:rStyle w:val="VerbatimChar"/>
         </w:rPr>
-        <w:t xml:space="preserve">Schaltplan_Hoftor_v2_KlemmenRelais.pdf</w:t>
+        <w:t xml:space="preserve">THALIA_DUO_BT_A80_A160.pdf</w:t>
       </w:r>
       <w:r>
         <w:t xml:space="preserve"> </w:t>
       </w:r>
       <w:r>
-        <w:t xml:space="preserve">(nutzt noch alte F-Anordnung ohne 11–20-Nummern)</w:t>
+        <w:t xml:space="preserve">(im Repo)</w:t>
       </w:r>
     </w:p>
     <w:bookmarkEnd w:id="22"/>

</xml_diff>

<commit_message>
Doku: PoE beibehalten + Sicherheitshinweis 2. Quelle
Entscheidung: ESP bleibt PoE-versorgt. Festgehalten, dass PoE eine 2.
Spannungsquelle ist, die der lokale Ausschalter nicht abdeckt -> zum
vollstaendigen Freischalten Netzwerkkabel ziehen. 24-V-Klemmen sind mit
Ausschalter AUS dennoch spannungsfrei (PoE = isoliertes SELV an RJ45).
In CLAUDE.md §4 + Verdrahtungs-Doku (Schaltschrank-Referenz).

Co-Authored-By: Claude Opus 4.8 <noreply@anthropic.com>
</commit_message>
<xml_diff>
--- a/Hoftor_Verdrahtung_v1.docx
+++ b/Hoftor_Verdrahtung_v1.docx
@@ -4605,6 +4605,59 @@
     <w:p>
       <w:pPr>
         <w:pStyle w:val="FirstParagraph"/>
+      </w:pPr>
+      <w:r>
+        <w:t xml:space="preserve">⚠️</w:t>
+      </w:r>
+      <w:r>
+        <w:t xml:space="preserve"> </w:t>
+      </w:r>
+      <w:r>
+        <w:rPr>
+          <w:b/>
+          <w:bCs/>
+        </w:rPr>
+        <w:t xml:space="preserve">Sicherheit (PoE):</w:t>
+      </w:r>
+      <w:r>
+        <w:t xml:space="preserve"> </w:t>
+      </w:r>
+      <w:r>
+        <w:t xml:space="preserve">Der ESP wird per PoE versorgt — das ist eine</w:t>
+      </w:r>
+      <w:r>
+        <w:t xml:space="preserve"> </w:t>
+      </w:r>
+      <w:r>
+        <w:rPr>
+          <w:b/>
+          <w:bCs/>
+        </w:rPr>
+        <w:t xml:space="preserve">2. Spannungsquelle vom Netzwerk-Switch, die der lokale Ausschalter NICHT abdeckt</w:t>
+      </w:r>
+      <w:r>
+        <w:t xml:space="preserve">. Die 24-V-Klemmen sind mit Ausschalter AUS dennoch spannungsfrei (isoliertes SELV ~48 V nur an der RJ45-/PD-Schaltung). Zum</w:t>
+      </w:r>
+      <w:r>
+        <w:t xml:space="preserve"> </w:t>
+      </w:r>
+      <w:r>
+        <w:rPr>
+          <w:b/>
+          <w:bCs/>
+        </w:rPr>
+        <w:t xml:space="preserve">vollständigen Freischalten zusätzlich das Netzwerkkabel ziehen</w:t>
+      </w:r>
+      <w:r>
+        <w:t xml:space="preserve"> </w:t>
+      </w:r>
+      <w:r>
+        <w:t xml:space="preserve">(oder PoE am Switch deaktivieren).</w:t>
+      </w:r>
+    </w:p>
+    <w:p>
+      <w:pPr>
+        <w:pStyle w:val="BodyText"/>
       </w:pPr>
       <w:r>
         <w:rPr>

</xml_diff>

<commit_message>
Doku KORREKTUR: Freischalten - 3 unabhaengige Quellen (Sicherheit)
Falsche Entwarnung entfernt ("24-V-Klemmen mit Ausschalter AUS spannungsfrei").
Richtig: Ausschalter trennt NUR den eigenen 24-V-Kreis. Unabhaengig bleiben:
(1) ESP via PoE, (2) BFT-Controller (eigene 230-V-Versorgung) -> BFT legt an
IC-Eingaengen 60-65 Sensorspannung an -> Reihenklemmen 1-6 koennen Spannung
fuehren trotz abgeschaltetem 24-V-Kreis. Vollstaendiges Freischalten = Aus-
schalter AUS + ESP-Netzwerkkabel ziehen + BFT separat spannungsfrei.

Prominenter Sicherheits-Abschnitt am Anfang der Verdrahtungs-Doku.

Co-Authored-By: Claude Opus 4.8 <noreply@anthropic.com>
</commit_message>
<xml_diff>
--- a/Hoftor_Verdrahtung_v1.docx
+++ b/Hoftor_Verdrahtung_v1.docx
@@ -28,7 +28,7 @@
         </w:p>
       </w:sdtContent>
     </w:sdt>
-    <w:bookmarkStart w:id="23" w:name="Xe18028861d75407b2317049ef8b4ac7079fad0b"/>
+    <w:bookmarkStart w:id="24" w:name="Xe18028861d75407b2317049ef8b4ac7079fad0b"/>
     <w:p>
       <w:pPr>
         <w:pStyle w:val="Heading1"/>
@@ -159,7 +159,161 @@
         </w:pict>
       </w:r>
     </w:p>
-    <w:bookmarkStart w:id="9" w:name="zweck-dieses-dokuments"/>
+    <w:bookmarkStart w:id="9" w:name="Xe56d02e92c3608877f5ce42ef12a7cb56bc8380"/>
+    <w:p>
+      <w:pPr>
+        <w:pStyle w:val="Heading2"/>
+      </w:pPr>
+      <w:r>
+        <w:t xml:space="preserve">⚠️ Sicherheit — vollständiges Spannungsfrei-Schalten</w:t>
+      </w:r>
+    </w:p>
+    <w:p>
+      <w:pPr>
+        <w:pStyle w:val="FirstParagraph"/>
+      </w:pPr>
+      <w:r>
+        <w:t xml:space="preserve">Der lokale Ausschalter (ABB) trennt</w:t>
+      </w:r>
+      <w:r>
+        <w:t xml:space="preserve"> </w:t>
+      </w:r>
+      <w:r>
+        <w:rPr>
+          <w:b/>
+          <w:bCs/>
+        </w:rPr>
+        <w:t xml:space="preserve">NUR den 24-V-Kreis dieser Steuerung</w:t>
+      </w:r>
+      <w:r>
+        <w:t xml:space="preserve"> </w:t>
+      </w:r>
+      <w:r>
+        <w:t xml:space="preserve">(PSU → R-/Bl-Block → RIF-0-Spulen, LEDs).</w:t>
+      </w:r>
+      <w:r>
+        <w:t xml:space="preserve"> </w:t>
+      </w:r>
+      <w:r>
+        <w:rPr>
+          <w:b/>
+          <w:bCs/>
+        </w:rPr>
+        <w:t xml:space="preserve">Nicht</w:t>
+      </w:r>
+      <w:r>
+        <w:t xml:space="preserve"> </w:t>
+      </w:r>
+      <w:r>
+        <w:t xml:space="preserve">abgeschaltet werden:</w:t>
+      </w:r>
+    </w:p>
+    <w:p>
+      <w:pPr>
+        <w:pStyle w:val="Compact"/>
+        <w:numPr>
+          <w:ilvl w:val="0"/>
+          <w:numId w:val="1002"/>
+        </w:numPr>
+      </w:pPr>
+      <w:r>
+        <w:rPr>
+          <w:b/>
+          <w:bCs/>
+        </w:rPr>
+        <w:t xml:space="preserve">ESP</w:t>
+      </w:r>
+      <w:r>
+        <w:t xml:space="preserve"> </w:t>
+      </w:r>
+      <w:r>
+        <w:t xml:space="preserve">— per PoE vom Netzwerk-Switch versorgt (isoliertes SELV ~48 V an der RJ45-Buchse).</w:t>
+      </w:r>
+    </w:p>
+    <w:p>
+      <w:pPr>
+        <w:pStyle w:val="Compact"/>
+        <w:numPr>
+          <w:ilvl w:val="0"/>
+          <w:numId w:val="1002"/>
+        </w:numPr>
+      </w:pPr>
+      <w:r>
+        <w:rPr>
+          <w:b/>
+          <w:bCs/>
+        </w:rPr>
+        <w:t xml:space="preserve">BFT-Controller</w:t>
+      </w:r>
+      <w:r>
+        <w:t xml:space="preserve"> </w:t>
+      </w:r>
+      <w:r>
+        <w:t xml:space="preserve">— hat eine</w:t>
+      </w:r>
+      <w:r>
+        <w:t xml:space="preserve"> </w:t>
+      </w:r>
+      <w:r>
+        <w:rPr>
+          <w:b/>
+          <w:bCs/>
+        </w:rPr>
+        <w:t xml:space="preserve">eigene 230-V-Versorgung</w:t>
+      </w:r>
+      <w:r>
+        <w:t xml:space="preserve">, unabhängig vom Ausschalter. Dadurch können die</w:t>
+      </w:r>
+      <w:r>
+        <w:t xml:space="preserve"> </w:t>
+      </w:r>
+      <w:r>
+        <w:rPr>
+          <w:b/>
+          <w:bCs/>
+        </w:rPr>
+        <w:t xml:space="preserve">Reihenklemmen 1–10 (BFT-Seite) Spannung führen</w:t>
+      </w:r>
+      <w:r>
+        <w:t xml:space="preserve"> </w:t>
+      </w:r>
+      <w:r>
+        <w:t xml:space="preserve">— insbesondere 1–6, da die BFT an ihren IC-Eingängen (60–65) ihre interne Sensorspannung gegen COM anlegt —</w:t>
+      </w:r>
+      <w:r>
+        <w:t xml:space="preserve"> </w:t>
+      </w:r>
+      <w:r>
+        <w:rPr>
+          <w:b/>
+          <w:bCs/>
+        </w:rPr>
+        <w:t xml:space="preserve">auch bei abgeschaltetem 24-V-Kreis</w:t>
+      </w:r>
+      <w:r>
+        <w:t xml:space="preserve">.</w:t>
+      </w:r>
+    </w:p>
+    <w:p>
+      <w:pPr>
+        <w:pStyle w:val="FirstParagraph"/>
+      </w:pPr>
+      <w:r>
+        <w:rPr>
+          <w:b/>
+          <w:bCs/>
+        </w:rPr>
+        <w:t xml:space="preserve">Vollständig spannungsfrei nur mit allen drei Schritten:</w:t>
+      </w:r>
+      <w:r>
+        <w:t xml:space="preserve"> </w:t>
+      </w:r>
+      <w:r>
+        <w:t xml:space="preserve">(a) lokaler Ausschalter AUS · (b) ESP-Netzwerkkabel ziehen (oder PoE am Switch deaktivieren) · (c) BFT-Controller separat spannungsfrei schalten.</w:t>
+      </w:r>
+    </w:p>
+    <w:bookmarkEnd w:id="9"/>
+    <w:bookmarkStart w:id="10" w:name="zweck-dieses-dokuments"/>
     <w:p>
       <w:pPr>
         <w:pStyle w:val="Heading2"/>
@@ -235,8 +389,8 @@
         <w:t xml:space="preserve">Der Verteiler-Innenausbau ist verdrahtet und per Foto verifiziert. Offen sind ESP-Seite, Tor-Adern (AHK-Kabel), LED-/Taster-Geräte und die 230 V-/24 V-Versorgung — siehe Abschnitt 13.</w:t>
       </w:r>
     </w:p>
-    <w:bookmarkEnd w:id="9"/>
-    <w:bookmarkStart w:id="10" w:name="durchgehende-nummerierung"/>
+    <w:bookmarkEnd w:id="10"/>
+    <w:bookmarkStart w:id="11" w:name="durchgehende-nummerierung"/>
     <w:p>
       <w:pPr>
         <w:pStyle w:val="Heading2"/>
@@ -554,8 +708,8 @@
         <w:t xml:space="preserve">bleiben als logischer Bezug für den Firmware-Code erhalten und sind in den Tabellen in Klammern angegeben.</w:t>
       </w:r>
     </w:p>
-    <w:bookmarkEnd w:id="10"/>
-    <w:bookmarkStart w:id="11" w:name="anschluss-benennung-klemmen-ebenen"/>
+    <w:bookmarkEnd w:id="11"/>
+    <w:bookmarkStart w:id="12" w:name="anschluss-benennung-klemmen-ebenen"/>
     <w:p>
       <w:pPr>
         <w:pStyle w:val="Heading2"/>
@@ -634,7 +788,7 @@
         <w:pStyle w:val="Compact"/>
         <w:numPr>
           <w:ilvl w:val="0"/>
-          <w:numId w:val="1002"/>
+          <w:numId w:val="1003"/>
         </w:numPr>
       </w:pPr>
       <w:r>
@@ -656,7 +810,7 @@
         <w:pStyle w:val="Compact"/>
         <w:numPr>
           <w:ilvl w:val="0"/>
-          <w:numId w:val="1002"/>
+          <w:numId w:val="1003"/>
         </w:numPr>
       </w:pPr>
       <w:r>
@@ -678,7 +832,7 @@
         <w:pStyle w:val="Compact"/>
         <w:numPr>
           <w:ilvl w:val="0"/>
-          <w:numId w:val="1002"/>
+          <w:numId w:val="1003"/>
         </w:numPr>
       </w:pPr>
       <w:r>
@@ -700,7 +854,7 @@
         <w:pStyle w:val="Compact"/>
         <w:numPr>
           <w:ilvl w:val="0"/>
-          <w:numId w:val="1002"/>
+          <w:numId w:val="1003"/>
         </w:numPr>
       </w:pPr>
       <w:r>
@@ -752,8 +906,8 @@
         <w:t xml:space="preserve">(Relais).</w:t>
       </w:r>
     </w:p>
-    <w:bookmarkEnd w:id="11"/>
-    <w:bookmarkStart w:id="12" w:name="reihenklemmen-block-a-110-belegung"/>
+    <w:bookmarkEnd w:id="12"/>
+    <w:bookmarkStart w:id="13" w:name="reihenklemmen-block-a-110-belegung"/>
     <w:p>
       <w:pPr>
         <w:pStyle w:val="Heading2"/>
@@ -1456,8 +1610,8 @@
         <w:t xml:space="preserve">Hinweis: Klemme 10 erhält +24 V über die FBS 2-5 rot (brückt 9↔10). Die Farbe der +24 V-Rückleiter-Adern (9-U/10-U) ist noch in Prüfung (Blau-Zuordnung kollidiert mit der GND-Konvention).</w:t>
       </w:r>
     </w:p>
-    <w:bookmarkEnd w:id="12"/>
-    <w:bookmarkStart w:id="13" w:name="koppelrelais-1120-belegung"/>
+    <w:bookmarkEnd w:id="13"/>
+    <w:bookmarkStart w:id="14" w:name="koppelrelais-1120-belegung"/>
     <w:p>
       <w:pPr>
         <w:pStyle w:val="Heading2"/>
@@ -2363,8 +2517,8 @@
         </w:tc>
       </w:tr>
     </w:tbl>
-    <w:bookmarkEnd w:id="13"/>
-    <w:bookmarkStart w:id="14" w:name="Xea0927a6af762e1808f1b0eb31eb8863eab3dbf"/>
+    <w:bookmarkEnd w:id="14"/>
+    <w:bookmarkStart w:id="15" w:name="Xea0927a6af762e1808f1b0eb31eb8863eab3dbf"/>
     <w:p>
       <w:pPr>
         <w:pStyle w:val="Heading2"/>
@@ -2931,8 +3085,8 @@
         <w:t xml:space="preserve">Bei Farbgleichheit Einzelader (20 AWG) bevorzugen — schont das AHK-Kabel. Einzeladern vorrätig: Gelb, Schwarz, Grün, Blau, Weiß, Rot. Nur Grau, Braun, Rosa, Weiß-Blau aus dem AHK-Rest ernten.</w:t>
       </w:r>
     </w:p>
-    <w:bookmarkEnd w:id="14"/>
-    <w:bookmarkStart w:id="15" w:name="versorgungs-stiche-r-bl-block-relais"/>
+    <w:bookmarkEnd w:id="15"/>
+    <w:bookmarkStart w:id="16" w:name="versorgungs-stiche-r-bl-block-relais"/>
     <w:p>
       <w:pPr>
         <w:pStyle w:val="Heading2"/>
@@ -3169,8 +3323,8 @@
         </w:tc>
       </w:tr>
     </w:tbl>
-    <w:bookmarkEnd w:id="15"/>
-    <w:bookmarkStart w:id="16" w:name="block-c-2126-led-taster"/>
+    <w:bookmarkEnd w:id="16"/>
+    <w:bookmarkStart w:id="17" w:name="block-c-2126-led-taster"/>
     <w:p>
       <w:pPr>
         <w:pStyle w:val="Heading2"/>
@@ -3604,8 +3758,8 @@
         </w:tc>
       </w:tr>
     </w:tbl>
-    <w:bookmarkEnd w:id="16"/>
-    <w:bookmarkStart w:id="17" w:name="taster-koppelrelais-r19"/>
+    <w:bookmarkEnd w:id="17"/>
+    <w:bookmarkStart w:id="18" w:name="taster-koppelrelais-r19"/>
     <w:p>
       <w:pPr>
         <w:pStyle w:val="Heading2"/>
@@ -3627,7 +3781,7 @@
         <w:pStyle w:val="Compact"/>
         <w:numPr>
           <w:ilvl w:val="0"/>
-          <w:numId w:val="1003"/>
+          <w:numId w:val="1004"/>
         </w:numPr>
       </w:pPr>
       <w:r>
@@ -3639,7 +3793,7 @@
         <w:pStyle w:val="Compact"/>
         <w:numPr>
           <w:ilvl w:val="0"/>
-          <w:numId w:val="1003"/>
+          <w:numId w:val="1004"/>
         </w:numPr>
       </w:pPr>
       <w:r>
@@ -3651,7 +3805,7 @@
         <w:pStyle w:val="Compact"/>
         <w:numPr>
           <w:ilvl w:val="0"/>
-          <w:numId w:val="1003"/>
+          <w:numId w:val="1004"/>
         </w:numPr>
       </w:pPr>
       <w:r>
@@ -3663,7 +3817,7 @@
         <w:pStyle w:val="Compact"/>
         <w:numPr>
           <w:ilvl w:val="0"/>
-          <w:numId w:val="1003"/>
+          <w:numId w:val="1004"/>
         </w:numPr>
       </w:pPr>
       <w:r>
@@ -3678,8 +3832,8 @@
         <w:t xml:space="preserve">Drücken: +24 V (Kl. 25) → Taster → Kl. 26 → R19-Spule zieht an → K11(+24 V) → K14 → DI3.</w:t>
       </w:r>
     </w:p>
-    <w:bookmarkEnd w:id="17"/>
-    <w:bookmarkStart w:id="18" w:name="steckbrücken-inventar-verbaut"/>
+    <w:bookmarkEnd w:id="18"/>
+    <w:bookmarkStart w:id="19" w:name="steckbrücken-inventar-verbaut"/>
     <w:p>
       <w:pPr>
         <w:pStyle w:val="Heading2"/>
@@ -3822,8 +3976,8 @@
         </w:tc>
       </w:tr>
     </w:tbl>
-    <w:bookmarkEnd w:id="18"/>
-    <w:bookmarkStart w:id="19" w:name="aderfarben-mapping-ahk-kabel-1305-mm²"/>
+    <w:bookmarkEnd w:id="19"/>
+    <w:bookmarkStart w:id="20" w:name="aderfarben-mapping-ahk-kabel-1305-mm²"/>
     <w:p>
       <w:pPr>
         <w:pStyle w:val="Heading2"/>
@@ -4416,8 +4570,8 @@
         <w:t xml:space="preserve">AHK-Adern vorhanden, aber noch nicht aufgelegt (Tor-Seite -U). Weiß-Schwarz ist intern für das Taster-Signal verwendet (Kl. 26 → R19-A1).</w:t>
       </w:r>
     </w:p>
-    <w:bookmarkEnd w:id="19"/>
-    <w:bookmarkStart w:id="20" w:name="designprinzipien"/>
+    <w:bookmarkEnd w:id="20"/>
+    <w:bookmarkStart w:id="21" w:name="designprinzipien"/>
     <w:p>
       <w:pPr>
         <w:pStyle w:val="Heading2"/>
@@ -4431,7 +4585,7 @@
         <w:pStyle w:val="Compact"/>
         <w:numPr>
           <w:ilvl w:val="0"/>
-          <w:numId w:val="1004"/>
+          <w:numId w:val="1005"/>
         </w:numPr>
       </w:pPr>
       <w:r>
@@ -4453,7 +4607,7 @@
         <w:pStyle w:val="Compact"/>
         <w:numPr>
           <w:ilvl w:val="0"/>
-          <w:numId w:val="1004"/>
+          <w:numId w:val="1005"/>
         </w:numPr>
       </w:pPr>
       <w:r>
@@ -4475,7 +4629,7 @@
         <w:pStyle w:val="Compact"/>
         <w:numPr>
           <w:ilvl w:val="0"/>
-          <w:numId w:val="1004"/>
+          <w:numId w:val="1005"/>
         </w:numPr>
       </w:pPr>
       <w:r>
@@ -4497,7 +4651,7 @@
         <w:pStyle w:val="Compact"/>
         <w:numPr>
           <w:ilvl w:val="0"/>
-          <w:numId w:val="1004"/>
+          <w:numId w:val="1005"/>
         </w:numPr>
       </w:pPr>
       <w:r>
@@ -4514,8 +4668,8 @@
         <w:t xml:space="preserve">Die orange AHK-Ader ähnelt zu sehr der roten Einzelader → Verwechslungsgefahr; Orange bleibt unbenutzt in der Reserve.</w:t>
       </w:r>
     </w:p>
-    <w:bookmarkEnd w:id="20"/>
-    <w:bookmarkStart w:id="21" w:name="Xcd06cc067264985d2c46afa0d09e902caf4562e"/>
+    <w:bookmarkEnd w:id="21"/>
+    <w:bookmarkStart w:id="22" w:name="Xcd06cc067264985d2c46afa0d09e902caf4562e"/>
     <w:p>
       <w:pPr>
         <w:pStyle w:val="Heading2"/>
@@ -4547,7 +4701,7 @@
         <w:pStyle w:val="Compact"/>
         <w:numPr>
           <w:ilvl w:val="0"/>
-          <w:numId w:val="1005"/>
+          <w:numId w:val="1006"/>
         </w:numPr>
       </w:pPr>
       <w:r>
@@ -4559,7 +4713,7 @@
         <w:pStyle w:val="Compact"/>
         <w:numPr>
           <w:ilvl w:val="0"/>
-          <w:numId w:val="1005"/>
+          <w:numId w:val="1006"/>
         </w:numPr>
       </w:pPr>
       <w:r>
@@ -4571,7 +4725,7 @@
         <w:pStyle w:val="Compact"/>
         <w:numPr>
           <w:ilvl w:val="0"/>
-          <w:numId w:val="1005"/>
+          <w:numId w:val="1006"/>
         </w:numPr>
       </w:pPr>
       <w:r>
@@ -4583,7 +4737,7 @@
         <w:pStyle w:val="Compact"/>
         <w:numPr>
           <w:ilvl w:val="0"/>
-          <w:numId w:val="1005"/>
+          <w:numId w:val="1006"/>
         </w:numPr>
       </w:pPr>
       <w:r>
@@ -4595,7 +4749,7 @@
         <w:pStyle w:val="Compact"/>
         <w:numPr>
           <w:ilvl w:val="0"/>
-          <w:numId w:val="1005"/>
+          <w:numId w:val="1006"/>
         </w:numPr>
       </w:pPr>
       <w:r>
@@ -4617,13 +4771,13 @@
           <w:b/>
           <w:bCs/>
         </w:rPr>
-        <w:t xml:space="preserve">Sicherheit (PoE):</w:t>
+        <w:t xml:space="preserve">Freischalten:</w:t>
       </w:r>
       <w:r>
         <w:t xml:space="preserve"> </w:t>
       </w:r>
       <w:r>
-        <w:t xml:space="preserve">Der ESP wird per PoE versorgt — das ist eine</w:t>
+        <w:t xml:space="preserve">siehe Sicherheitshinweis am Dokumentanfang — der Ausschalter trennt nur den 24-V-Kreis;</w:t>
       </w:r>
       <w:r>
         <w:t xml:space="preserve"> </w:t>
@@ -4633,26 +4787,13 @@
           <w:b/>
           <w:bCs/>
         </w:rPr>
-        <w:t xml:space="preserve">2. Spannungsquelle vom Netzwerk-Switch, die der lokale Ausschalter NICHT abdeckt</w:t>
-      </w:r>
-      <w:r>
-        <w:t xml:space="preserve">. Die 24-V-Klemmen sind mit Ausschalter AUS dennoch spannungsfrei (isoliertes SELV ~48 V nur an der RJ45-/PD-Schaltung). Zum</w:t>
+        <w:t xml:space="preserve">ESP (PoE) und BFT (eigene 230-V-Versorgung) bleiben unabhängig spannungsführend</w:t>
       </w:r>
       <w:r>
         <w:t xml:space="preserve"> </w:t>
       </w:r>
       <w:r>
-        <w:rPr>
-          <w:b/>
-          <w:bCs/>
-        </w:rPr>
-        <w:t xml:space="preserve">vollständigen Freischalten zusätzlich das Netzwerkkabel ziehen</w:t>
-      </w:r>
-      <w:r>
-        <w:t xml:space="preserve"> </w:t>
-      </w:r>
-      <w:r>
-        <w:t xml:space="preserve">(oder PoE am Switch deaktivieren).</w:t>
+        <w:t xml:space="preserve">(BFT speist die Klemmen 1–10).</w:t>
       </w:r>
     </w:p>
     <w:p>
@@ -4678,7 +4819,7 @@
         <w:pStyle w:val="Compact"/>
         <w:numPr>
           <w:ilvl w:val="0"/>
-          <w:numId w:val="1006"/>
+          <w:numId w:val="1007"/>
         </w:numPr>
       </w:pPr>
       <w:r>
@@ -4690,7 +4831,7 @@
         <w:pStyle w:val="Compact"/>
         <w:numPr>
           <w:ilvl w:val="0"/>
-          <w:numId w:val="1006"/>
+          <w:numId w:val="1007"/>
         </w:numPr>
       </w:pPr>
       <w:r>
@@ -4702,7 +4843,7 @@
         <w:pStyle w:val="Compact"/>
         <w:numPr>
           <w:ilvl w:val="0"/>
-          <w:numId w:val="1006"/>
+          <w:numId w:val="1007"/>
         </w:numPr>
       </w:pPr>
       <w:r>
@@ -4726,7 +4867,7 @@
         <w:pStyle w:val="Compact"/>
         <w:numPr>
           <w:ilvl w:val="0"/>
-          <w:numId w:val="1007"/>
+          <w:numId w:val="1008"/>
         </w:numPr>
       </w:pPr>
       <w:r>
@@ -4750,76 +4891,11 @@
         <w:pStyle w:val="Compact"/>
         <w:numPr>
           <w:ilvl w:val="0"/>
-          <w:numId w:val="1008"/>
+          <w:numId w:val="1009"/>
         </w:numPr>
       </w:pPr>
       <w:r>
         <w:t xml:space="preserve">230 V L/N/PE (Block B) einführen</w:t>
-      </w:r>
-    </w:p>
-    <w:p>
-      <w:pPr>
-        <w:pStyle w:val="Compact"/>
-        <w:numPr>
-          <w:ilvl w:val="0"/>
-          <w:numId w:val="1008"/>
-        </w:numPr>
-      </w:pPr>
-      <w:r>
-        <w:t xml:space="preserve">24 V-Netzteil auf Hutschiene (Reihe 1)</w:t>
-      </w:r>
-    </w:p>
-    <w:p>
-      <w:pPr>
-        <w:pStyle w:val="Compact"/>
-        <w:numPr>
-          <w:ilvl w:val="0"/>
-          <w:numId w:val="1008"/>
-        </w:numPr>
-      </w:pPr>
-      <w:r>
-        <w:t xml:space="preserve">PSU+ → Sicherung 27 → R-a (+24 V-Einspeisung)</w:t>
-      </w:r>
-    </w:p>
-    <w:p>
-      <w:pPr>
-        <w:pStyle w:val="Compact"/>
-        <w:numPr>
-          <w:ilvl w:val="0"/>
-          <w:numId w:val="1008"/>
-        </w:numPr>
-      </w:pPr>
-      <w:r>
-        <w:t xml:space="preserve">PSU− → Bl-a (GND-Einspeisung)</w:t>
-      </w:r>
-    </w:p>
-    <w:p>
-      <w:pPr>
-        <w:pStyle w:val="Compact"/>
-        <w:numPr>
-          <w:ilvl w:val="0"/>
-          <w:numId w:val="1008"/>
-        </w:numPr>
-      </w:pPr>
-      <w:r>
-        <w:t xml:space="preserve">Sicherung 28 = Reserve (falls ESP intern versorgt)</w:t>
-      </w:r>
-    </w:p>
-    <w:p>
-      <w:r>
-        <w:pict>
-          <v:rect style="width:0;height:1.5pt" o:hralign="center" o:hrstd="t" o:hr="t"/>
-        </w:pict>
-      </w:r>
-    </w:p>
-    <w:bookmarkEnd w:id="21"/>
-    <w:bookmarkStart w:id="22" w:name="querverweise"/>
-    <w:p>
-      <w:pPr>
-        <w:pStyle w:val="Heading2"/>
-      </w:pPr>
-      <w:r>
-        <w:t xml:space="preserve">14. Querverweise</w:t>
       </w:r>
     </w:p>
     <w:p>
@@ -4831,6 +4907,71 @@
         </w:numPr>
       </w:pPr>
       <w:r>
+        <w:t xml:space="preserve">24 V-Netzteil auf Hutschiene (Reihe 1)</w:t>
+      </w:r>
+    </w:p>
+    <w:p>
+      <w:pPr>
+        <w:pStyle w:val="Compact"/>
+        <w:numPr>
+          <w:ilvl w:val="0"/>
+          <w:numId w:val="1009"/>
+        </w:numPr>
+      </w:pPr>
+      <w:r>
+        <w:t xml:space="preserve">PSU+ → Sicherung 27 → R-a (+24 V-Einspeisung)</w:t>
+      </w:r>
+    </w:p>
+    <w:p>
+      <w:pPr>
+        <w:pStyle w:val="Compact"/>
+        <w:numPr>
+          <w:ilvl w:val="0"/>
+          <w:numId w:val="1009"/>
+        </w:numPr>
+      </w:pPr>
+      <w:r>
+        <w:t xml:space="preserve">PSU− → Bl-a (GND-Einspeisung)</w:t>
+      </w:r>
+    </w:p>
+    <w:p>
+      <w:pPr>
+        <w:pStyle w:val="Compact"/>
+        <w:numPr>
+          <w:ilvl w:val="0"/>
+          <w:numId w:val="1009"/>
+        </w:numPr>
+      </w:pPr>
+      <w:r>
+        <w:t xml:space="preserve">Sicherung 28 = Reserve (falls ESP intern versorgt)</w:t>
+      </w:r>
+    </w:p>
+    <w:p>
+      <w:r>
+        <w:pict>
+          <v:rect style="width:0;height:1.5pt" o:hralign="center" o:hrstd="t" o:hr="t"/>
+        </w:pict>
+      </w:r>
+    </w:p>
+    <w:bookmarkEnd w:id="22"/>
+    <w:bookmarkStart w:id="23" w:name="querverweise"/>
+    <w:p>
+      <w:pPr>
+        <w:pStyle w:val="Heading2"/>
+      </w:pPr>
+      <w:r>
+        <w:t xml:space="preserve">14. Querverweise</w:t>
+      </w:r>
+    </w:p>
+    <w:p>
+      <w:pPr>
+        <w:pStyle w:val="Compact"/>
+        <w:numPr>
+          <w:ilvl w:val="0"/>
+          <w:numId w:val="1010"/>
+        </w:numPr>
+      </w:pPr>
+      <w:r>
         <w:rPr>
           <w:b/>
           <w:bCs/>
@@ -4852,7 +4993,7 @@
         <w:pStyle w:val="Compact"/>
         <w:numPr>
           <w:ilvl w:val="0"/>
-          <w:numId w:val="1009"/>
+          <w:numId w:val="1010"/>
         </w:numPr>
       </w:pPr>
       <w:r>
@@ -4892,7 +5033,7 @@
         <w:pStyle w:val="Compact"/>
         <w:numPr>
           <w:ilvl w:val="0"/>
-          <w:numId w:val="1009"/>
+          <w:numId w:val="1010"/>
         </w:numPr>
       </w:pPr>
       <w:r>
@@ -4918,8 +5059,8 @@
         <w:t xml:space="preserve">(im Repo)</w:t>
       </w:r>
     </w:p>
-    <w:bookmarkEnd w:id="22"/>
     <w:bookmarkEnd w:id="23"/>
+    <w:bookmarkEnd w:id="24"/>
     <w:sectPr>
       <w:footnotePr>
         <w:numRestart w:val="eachSect"/>
@@ -5133,6 +5274,91 @@
       </w:rPr>
     </w:lvl>
   </w:abstractNum>
+  <w:abstractNum w:abstractNumId="99411">
+    <w:nsid w:val="00A99411"/>
+    <w:multiLevelType w:val="multilevel"/>
+    <w:lvl w:ilvl="0">
+      <w:start w:val="1"/>
+      <w:numFmt w:val="decimal"/>
+      <w:lvlText w:val="%1."/>
+      <w:lvlJc w:val="left"/>
+      <w:pPr>
+        <w:ind w:left="720" w:hanging="360"/>
+      </w:pPr>
+    </w:lvl>
+    <w:lvl w:ilvl="1">
+      <w:start w:val="1"/>
+      <w:numFmt w:val="decimal"/>
+      <w:lvlText w:val="%2."/>
+      <w:lvlJc w:val="left"/>
+      <w:pPr>
+        <w:ind w:left="1440" w:hanging="360"/>
+      </w:pPr>
+    </w:lvl>
+    <w:lvl w:ilvl="2">
+      <w:start w:val="1"/>
+      <w:numFmt w:val="decimal"/>
+      <w:lvlText w:val="%3."/>
+      <w:lvlJc w:val="left"/>
+      <w:pPr>
+        <w:ind w:left="2160" w:hanging="360"/>
+      </w:pPr>
+    </w:lvl>
+    <w:lvl w:ilvl="3">
+      <w:start w:val="1"/>
+      <w:numFmt w:val="decimal"/>
+      <w:lvlText w:val="%4."/>
+      <w:lvlJc w:val="left"/>
+      <w:pPr>
+        <w:ind w:left="2880" w:hanging="360"/>
+      </w:pPr>
+    </w:lvl>
+    <w:lvl w:ilvl="4">
+      <w:start w:val="1"/>
+      <w:numFmt w:val="decimal"/>
+      <w:lvlText w:val="%5."/>
+      <w:lvlJc w:val="left"/>
+      <w:pPr>
+        <w:ind w:left="3600" w:hanging="360"/>
+      </w:pPr>
+    </w:lvl>
+    <w:lvl w:ilvl="5">
+      <w:start w:val="1"/>
+      <w:numFmt w:val="decimal"/>
+      <w:lvlText w:val="%6."/>
+      <w:lvlJc w:val="left"/>
+      <w:pPr>
+        <w:ind w:left="4320" w:hanging="360"/>
+      </w:pPr>
+    </w:lvl>
+    <w:lvl w:ilvl="6">
+      <w:start w:val="1"/>
+      <w:numFmt w:val="decimal"/>
+      <w:lvlText w:val="%7."/>
+      <w:lvlJc w:val="left"/>
+      <w:pPr>
+        <w:ind w:left="5040" w:hanging="360"/>
+      </w:pPr>
+    </w:lvl>
+    <w:lvl w:ilvl="7">
+      <w:start w:val="1"/>
+      <w:numFmt w:val="decimal"/>
+      <w:lvlText w:val="%8."/>
+      <w:lvlJc w:val="left"/>
+      <w:pPr>
+        <w:ind w:left="5760" w:hanging="360"/>
+      </w:pPr>
+    </w:lvl>
+    <w:lvl w:ilvl="8">
+      <w:start w:val="1"/>
+      <w:numFmt w:val="decimal"/>
+      <w:lvlText w:val="%9."/>
+      <w:lvlJc w:val="left"/>
+      <w:pPr>
+        <w:ind w:left="6480" w:hanging="360"/>
+      </w:pPr>
+    </w:lvl>
+  </w:abstractNum>
   <w:num w:numId="1000">
     <w:abstractNumId w:val="990"/>
   </w:num>
@@ -5140,7 +5366,34 @@
     <w:abstractNumId w:val="991"/>
   </w:num>
   <w:num w:numId="1002">
-    <w:abstractNumId w:val="991"/>
+    <w:abstractNumId w:val="99411"/>
+    <w:lvlOverride w:ilvl="0">
+      <w:startOverride w:val="1"/>
+    </w:lvlOverride>
+    <w:lvlOverride w:ilvl="1">
+      <w:startOverride w:val="1"/>
+    </w:lvlOverride>
+    <w:lvlOverride w:ilvl="2">
+      <w:startOverride w:val="1"/>
+    </w:lvlOverride>
+    <w:lvlOverride w:ilvl="3">
+      <w:startOverride w:val="1"/>
+    </w:lvlOverride>
+    <w:lvlOverride w:ilvl="4">
+      <w:startOverride w:val="1"/>
+    </w:lvlOverride>
+    <w:lvlOverride w:ilvl="5">
+      <w:startOverride w:val="1"/>
+    </w:lvlOverride>
+    <w:lvlOverride w:ilvl="6">
+      <w:startOverride w:val="1"/>
+    </w:lvlOverride>
+    <w:lvlOverride w:ilvl="7">
+      <w:startOverride w:val="1"/>
+    </w:lvlOverride>
+    <w:lvlOverride w:ilvl="8">
+      <w:startOverride w:val="1"/>
+    </w:lvlOverride>
   </w:num>
   <w:num w:numId="1003">
     <w:abstractNumId w:val="991"/>
@@ -5161,6 +5414,9 @@
     <w:abstractNumId w:val="991"/>
   </w:num>
   <w:num w:numId="1009">
+    <w:abstractNumId w:val="991"/>
+  </w:num>
+  <w:num w:numId="1010">
     <w:abstractNumId w:val="991"/>
   </w:num>
 </w:numbering>

</xml_diff>

<commit_message>
Doku: PSU/Sicherungs-Block aktualisiert (Phoenix 0,63A, 1A T)
- PSU: Phoenix 24V/0,63A/15W (war DEWIN 1,5A) - ESP per PoE, nicht am PSU,
  Last ~0,1-0,23A -> ~3x Reserve
- Sicherung 27 = 1A T Glas (matcht 0,63A-PSU), PSU+ -> Sich.27 -> R-a (rot)
  Seite/Polaritaet egal: HESILED hat antiparallele LEDs (Schaltplan 3211903)
- Sicherung 28 = +24V-Reserve (leer); GND/0V NICHT abgesichert
- alle Stellen konsistent (§4/§6a/§9/§11 + ASCII-Layout + Verdrahtungs-Doku)

Co-Authored-By: Claude Opus 4.8 <noreply@anthropic.com>
</commit_message>
<xml_diff>
--- a/Hoftor_Verdrahtung_v1.docx
+++ b/Hoftor_Verdrahtung_v1.docx
@@ -589,18 +589,50 @@
               <w:pStyle w:val="Compact"/>
             </w:pPr>
             <w:r>
-              <w:t xml:space="preserve">2 Sicherungshalter</w:t>
-            </w:r>
-          </w:p>
-        </w:tc>
-        <w:tc>
-          <w:tcPr/>
-          <w:p>
-            <w:pPr>
-              <w:pStyle w:val="Compact"/>
-            </w:pPr>
-            <w:r>
-              <w:t xml:space="preserve">27 = 24 V-Hauptsicherung 2 A T · 28 = Reserve</w:t>
+              <w:t xml:space="preserve">2 Sicherungshalter (PT 4-HESILED 24)</w:t>
+            </w:r>
+          </w:p>
+        </w:tc>
+        <w:tc>
+          <w:tcPr/>
+          <w:p>
+            <w:pPr>
+              <w:pStyle w:val="Compact"/>
+            </w:pPr>
+            <w:r>
+              <w:t xml:space="preserve">27 = 24-V-Hauptsicherung</w:t>
+            </w:r>
+            <w:r>
+              <w:t xml:space="preserve"> </w:t>
+            </w:r>
+            <w:r>
+              <w:rPr>
+                <w:b/>
+                <w:bCs/>
+              </w:rPr>
+              <w:t xml:space="preserve">1 A T</w:t>
+            </w:r>
+            <w:r>
+              <w:t xml:space="preserve"> </w:t>
+            </w:r>
+            <w:r>
+              <w:t xml:space="preserve">(PSU+ → R-a) · 28 =</w:t>
+            </w:r>
+            <w:r>
+              <w:t xml:space="preserve"> </w:t>
+            </w:r>
+            <w:r>
+              <w:rPr>
+                <w:b/>
+                <w:bCs/>
+              </w:rPr>
+              <w:t xml:space="preserve">+24-V-Reserve</w:t>
+            </w:r>
+            <w:r>
+              <w:t xml:space="preserve"> </w:t>
+            </w:r>
+            <w:r>
+              <w:t xml:space="preserve">(leer)</w:t>
             </w:r>
           </w:p>
         </w:tc>
@@ -4668,6 +4700,44 @@
         <w:t xml:space="preserve">Die orange AHK-Ader ähnelt zu sehr der roten Einzelader → Verwechslungsgefahr; Orange bleibt unbenutzt in der Reserve.</w:t>
       </w:r>
     </w:p>
+    <w:p>
+      <w:pPr>
+        <w:pStyle w:val="Compact"/>
+        <w:numPr>
+          <w:ilvl w:val="0"/>
+          <w:numId w:val="1005"/>
+        </w:numPr>
+      </w:pPr>
+      <w:r>
+        <w:rPr>
+          <w:b/>
+          <w:bCs/>
+        </w:rPr>
+        <w:t xml:space="preserve">24-V-Absicherung nur im Plusleiter:</w:t>
+      </w:r>
+      <w:r>
+        <w:t xml:space="preserve"> </w:t>
+      </w:r>
+      <w:r>
+        <w:t xml:space="preserve">Sicherung 27 (1 A T) in der +24-V-Einspeisung (HESILED mit antiparalleler LED → Einspeiseseite/Polarität egal).</w:t>
+      </w:r>
+      <w:r>
+        <w:t xml:space="preserve"> </w:t>
+      </w:r>
+      <w:r>
+        <w:rPr>
+          <w:b/>
+          <w:bCs/>
+        </w:rPr>
+        <w:t xml:space="preserve">GND/0 V wird NICHT abgesichert</w:t>
+      </w:r>
+      <w:r>
+        <w:t xml:space="preserve"> </w:t>
+      </w:r>
+      <w:r>
+        <w:t xml:space="preserve">— der Rückleiter muss als Referenz immer durchverbunden bleiben.</w:t>
+      </w:r>
+    </w:p>
     <w:bookmarkEnd w:id="21"/>
     <w:bookmarkStart w:id="22" w:name="Xcd06cc067264985d2c46afa0d09e902caf4562e"/>
     <w:p>
@@ -4907,7 +4977,23 @@
         </w:numPr>
       </w:pPr>
       <w:r>
-        <w:t xml:space="preserve">24 V-Netzteil auf Hutschiene (Reihe 1)</w:t>
+        <w:t xml:space="preserve">24-V-Netzteil</w:t>
+      </w:r>
+      <w:r>
+        <w:t xml:space="preserve"> </w:t>
+      </w:r>
+      <w:r>
+        <w:rPr>
+          <w:b/>
+          <w:bCs/>
+        </w:rPr>
+        <w:t xml:space="preserve">Phoenix 0,63 A / 15 W</w:t>
+      </w:r>
+      <w:r>
+        <w:t xml:space="preserve"> </w:t>
+      </w:r>
+      <w:r>
+        <w:t xml:space="preserve">auf Hutschiene (Reihe 1) — ESP hängt per PoE NICHT am PSU</w:t>
       </w:r>
     </w:p>
     <w:p>
@@ -4919,7 +5005,17 @@
         </w:numPr>
       </w:pPr>
       <w:r>
-        <w:t xml:space="preserve">PSU+ → Sicherung 27 → R-a (+24 V-Einspeisung)</w:t>
+        <w:rPr>
+          <w:b/>
+          <w:bCs/>
+        </w:rPr>
+        <w:t xml:space="preserve">PSU+ → Sicherung 27 (1 A T) → R-a</w:t>
+      </w:r>
+      <w:r>
+        <w:t xml:space="preserve"> </w:t>
+      </w:r>
+      <w:r>
+        <w:t xml:space="preserve">(Rot 0,5 mm²; Seite egal — antiparallele LED in der HESILED)</w:t>
       </w:r>
     </w:p>
     <w:p>
@@ -4931,7 +5027,33 @@
         </w:numPr>
       </w:pPr>
       <w:r>
-        <w:t xml:space="preserve">PSU− → Bl-a (GND-Einspeisung)</w:t>
+        <w:rPr>
+          <w:b/>
+          <w:bCs/>
+        </w:rPr>
+        <w:t xml:space="preserve">PSU− → Bl-a</w:t>
+      </w:r>
+      <w:r>
+        <w:t xml:space="preserve"> </w:t>
+      </w:r>
+      <w:r>
+        <w:t xml:space="preserve">(GND,</w:t>
+      </w:r>
+      <w:r>
+        <w:t xml:space="preserve"> </w:t>
+      </w:r>
+      <w:r>
+        <w:rPr>
+          <w:b/>
+          <w:bCs/>
+        </w:rPr>
+        <w:t xml:space="preserve">ungesichert</w:t>
+      </w:r>
+      <w:r>
+        <w:t xml:space="preserve"> </w:t>
+      </w:r>
+      <w:r>
+        <w:t xml:space="preserve">— 0-V-Rückleiter nie absichern)</w:t>
       </w:r>
     </w:p>
     <w:p>
@@ -4943,7 +5065,23 @@
         </w:numPr>
       </w:pPr>
       <w:r>
-        <w:t xml:space="preserve">Sicherung 28 = Reserve (falls ESP intern versorgt)</w:t>
+        <w:t xml:space="preserve">Sicherung 28 =</w:t>
+      </w:r>
+      <w:r>
+        <w:t xml:space="preserve"> </w:t>
+      </w:r>
+      <w:r>
+        <w:rPr>
+          <w:b/>
+          <w:bCs/>
+        </w:rPr>
+        <w:t xml:space="preserve">+24-V-Reserve</w:t>
+      </w:r>
+      <w:r>
+        <w:t xml:space="preserve"> </w:t>
+      </w:r>
+      <w:r>
+        <w:t xml:space="preserve">(leer)</w:t>
       </w:r>
     </w:p>
     <w:p>

</xml_diff>

<commit_message>
Doku: O/U-Bezeichnung auch fuer Sicherungshalter (27-O=PSU+, 27-U=R-a)
-O/-U gilt jetzt schrankweit (Reihenklemmen, Block C, Sicherungshalter).
Sicherung 27: PSU+ auf 27-O, R-a auf 27-U (unterer Anschluss, Florian).
In Anschluss-Benennung, §6a-Uebersicht/Checkliste, §9 + Verdrahtungs-Doku.

Co-Authored-By: Claude Opus 4.8 <noreply@anthropic.com>
</commit_message>
<xml_diff>
--- a/Hoftor_Verdrahtung_v1.docx
+++ b/Hoftor_Verdrahtung_v1.docx
@@ -600,7 +600,7 @@
               <w:pStyle w:val="Compact"/>
             </w:pPr>
             <w:r>
-              <w:t xml:space="preserve">27 = 24-V-Hauptsicherung</w:t>
+              <w:t xml:space="preserve">27 =</w:t>
             </w:r>
             <w:r>
               <w:t xml:space="preserve"> </w:t>
@@ -613,10 +613,36 @@
               <w:t xml:space="preserve">1 A T</w:t>
             </w:r>
             <w:r>
+              <w:t xml:space="preserve">: PSU+ auf</w:t>
+            </w:r>
+            <w:r>
               <w:t xml:space="preserve"> </w:t>
             </w:r>
             <w:r>
-              <w:t xml:space="preserve">(PSU+ → R-a) · 28 =</w:t>
+              <w:rPr>
+                <w:b/>
+                <w:bCs/>
+              </w:rPr>
+              <w:t xml:space="preserve">27-O</w:t>
+            </w:r>
+            <w:r>
+              <w:t xml:space="preserve">,</w:t>
+            </w:r>
+            <w:r>
+              <w:t xml:space="preserve"> </w:t>
+            </w:r>
+            <w:r>
+              <w:rPr>
+                <w:b/>
+                <w:bCs/>
+              </w:rPr>
+              <w:t xml:space="preserve">27-U</w:t>
+            </w:r>
+            <w:r>
+              <w:t xml:space="preserve"> </w:t>
+            </w:r>
+            <w:r>
+              <w:t xml:space="preserve">→ R-a · 28 =</w:t>
             </w:r>
             <w:r>
               <w:t xml:space="preserve"> </w:t>
@@ -800,7 +826,39 @@
         <w:t xml:space="preserve"> </w:t>
       </w:r>
       <w:r>
-        <w:t xml:space="preserve">= Mitte.</w:t>
+        <w:t xml:space="preserve">= Mitte. Die</w:t>
+      </w:r>
+      <w:r>
+        <w:t xml:space="preserve"> </w:t>
+      </w:r>
+      <w:r>
+        <w:rPr>
+          <w:b/>
+          <w:bCs/>
+        </w:rPr>
+        <w:t xml:space="preserve">-O/-U-Bezeichnung gilt im ganzen Schrank</w:t>
+      </w:r>
+      <w:r>
+        <w:t xml:space="preserve"> </w:t>
+      </w:r>
+      <w:r>
+        <w:t xml:space="preserve">— auch Block C (21–26) und</w:t>
+      </w:r>
+      <w:r>
+        <w:t xml:space="preserve"> </w:t>
+      </w:r>
+      <w:r>
+        <w:rPr>
+          <w:b/>
+          <w:bCs/>
+        </w:rPr>
+        <w:t xml:space="preserve">Sicherungshalter 27/28</w:t>
+      </w:r>
+      <w:r>
+        <w:t xml:space="preserve"> </w:t>
+      </w:r>
+      <w:r>
+        <w:t xml:space="preserve">(z. B. 27-O = PSU+, 27-U = R-a).</w:t>
       </w:r>
     </w:p>
     <w:p>
@@ -5009,13 +5067,13 @@
           <w:b/>
           <w:bCs/>
         </w:rPr>
-        <w:t xml:space="preserve">PSU+ → Sicherung 27 (1 A T) → R-a</w:t>
-      </w:r>
-      <w:r>
-        <w:t xml:space="preserve"> </w:t>
-      </w:r>
-      <w:r>
-        <w:t xml:space="preserve">(Rot 0,5 mm²; Seite egal — antiparallele LED in der HESILED)</w:t>
+        <w:t xml:space="preserve">PSU+ → Sicherung 27-O (1 A T) · 27-U → R-a</w:t>
+      </w:r>
+      <w:r>
+        <w:t xml:space="preserve"> </w:t>
+      </w:r>
+      <w:r>
+        <w:t xml:space="preserve">(Rot 0,5 mm²; Polarität egal — antiparallele LED in der HESILED)</w:t>
       </w:r>
     </w:p>
     <w:p>

</xml_diff>

<commit_message>
Doku: 27-U->R-a verdrahtet; Sicherung 1A T noch nicht gesteckt
Ader Rot 27-U->R-a liegt. Sicherungseinsatz bewusst bis Inbetriebnahme
draussen -> +24-V-Kreis bleibt waehrend Aufbau spannungslos. PSU+ ->
27-O ebenfalls offen.

Co-Authored-By: Claude Opus 4.8 <noreply@anthropic.com>
</commit_message>
<xml_diff>
--- a/Hoftor_Verdrahtung_v1.docx
+++ b/Hoftor_Verdrahtung_v1.docx
@@ -5067,13 +5067,45 @@
           <w:b/>
           <w:bCs/>
         </w:rPr>
-        <w:t xml:space="preserve">PSU+ → Sicherung 27-O (1 A T) · 27-U → R-a</w:t>
-      </w:r>
-      <w:r>
-        <w:t xml:space="preserve"> </w:t>
-      </w:r>
-      <w:r>
-        <w:t xml:space="preserve">(Rot 0,5 mm²; Polarität egal — antiparallele LED in der HESILED)</w:t>
+        <w:t xml:space="preserve">27-U → R-a</w:t>
+      </w:r>
+      <w:r>
+        <w:t xml:space="preserve"> </w:t>
+      </w:r>
+      <w:r>
+        <w:t xml:space="preserve">✓ verdrahtet (Rot 0,5 mm²) · offen:</w:t>
+      </w:r>
+      <w:r>
+        <w:t xml:space="preserve"> </w:t>
+      </w:r>
+      <w:r>
+        <w:rPr>
+          <w:b/>
+          <w:bCs/>
+        </w:rPr>
+        <w:t xml:space="preserve">PSU+ → 27-O</w:t>
+      </w:r>
+      <w:r>
+        <w:t xml:space="preserve"> </w:t>
+      </w:r>
+      <w:r>
+        <w:t xml:space="preserve">+</w:t>
+      </w:r>
+      <w:r>
+        <w:t xml:space="preserve"> </w:t>
+      </w:r>
+      <w:r>
+        <w:rPr>
+          <w:b/>
+          <w:bCs/>
+        </w:rPr>
+        <w:t xml:space="preserve">Sicherung 1 A T stecken</w:t>
+      </w:r>
+      <w:r>
+        <w:t xml:space="preserve"> </w:t>
+      </w:r>
+      <w:r>
+        <w:t xml:space="preserve">(Sicherung bleibt bis Inbetriebnahme draußen → +24-V-Kreis spannungslos). Polarität egal — antiparallele LED in der HESILED.</w:t>
       </w:r>
     </w:p>
     <w:p>

</xml_diff>

<commit_message>
Hoftor 10-06: Versorgungsstrang + ESP-Gruppe-1 verdrahtet, Antriebsfarben-Schema
- Versorgung: Hager SBN225 + Phoenix STEP POWER 1088495 dokumentiert
  (statt ABB/generisch); 230V-Klemmen -> Hager -> PSU -> Sicherung 27 -> R-Block,
  PSU- -> Bl-Block verkabelt; Glassicherung-Element-Status noch zu bestaetigen.
- ESP Gruppe 1 verdrahtet: 6 Relais-COMs <- +24V (R-c/e/g/i/k/m),
  6 Spulenantriebe NO -> A1 (R11-R16).
- Antriebsfarbe = Funktionsfarbe des Kanals (durchgaengig BFT->Waveshare):
  R11 grau / R12 gruen / R13 weiss / R14 gelb / R15+R16 rot (LED).
  Ersetzt fruehere schwarz-Festlegung (Schwarz = COM-Haupt -> Kollision).
- DI-Signalfarben rot/rosa/weiss-schwarz + COM-vs-DGND-Hinweis ergaenzt (noch offen).
- CLAUDE.md, Hoftor_Verdrahtung_v1.md, aderfarben_template.md angeglichen;
  Hoftor_Verdrahtung_v1.docx aus .md neu generiert (pandoc).

Co-Authored-By: Claude Opus 4.8 <noreply@anthropic.com>
</commit_message>
<xml_diff>
--- a/Hoftor_Verdrahtung_v1.docx
+++ b/Hoftor_Verdrahtung_v1.docx
@@ -2,32 +2,6 @@
 <file path=word/document.xml><?xml version="1.0" encoding="utf-8"?>
 <w:document xmlns:w="http://schemas.openxmlformats.org/wordprocessingml/2006/main" xmlns:m="http://schemas.openxmlformats.org/officeDocument/2006/math" xmlns:r="http://schemas.openxmlformats.org/officeDocument/2006/relationships" xmlns:o="urn:schemas-microsoft-com:office:office" xmlns:v="urn:schemas-microsoft-com:vml" xmlns:w10="urn:schemas-microsoft-com:office:word" xmlns:a="http://schemas.openxmlformats.org/drawingml/2006/main" xmlns:pic="http://schemas.openxmlformats.org/drawingml/2006/picture" xmlns:wp="http://schemas.openxmlformats.org/drawingml/2006/wordprocessingDrawing">
   <w:body>
-    <w:sdt>
-      <w:sdtPr>
-        <w:docPartObj>
-          <w:docPartGallery w:val="Table of Contents"/>
-          <w:docPartUnique/>
-        </w:docPartObj>
-      </w:sdtPr>
-      <w:sdtContent>
-        <w:p>
-          <w:pPr>
-            <w:pStyle w:val="TOCHeading"/>
-          </w:pPr>
-          <w:r>
-            <w:t xml:space="preserve">Table of Contents</w:t>
-          </w:r>
-        </w:p>
-        <w:p>
-          <w:r>
-            <w:fldChar w:fldCharType="begin" w:dirty="true"/>
-            <w:instrText xml:space="preserve">TOC \o "1-2" \h \z \u</w:instrText>
-            <w:fldChar w:fldCharType="separate"/>
-            <w:fldChar w:fldCharType="end"/>
-          </w:r>
-        </w:p>
-      </w:sdtContent>
-    </w:sdt>
     <w:bookmarkStart w:id="24" w:name="Xe18028861d75407b2317049ef8b4ac7079fad0b"/>
     <w:p>
       <w:pPr>
@@ -143,7 +117,7 @@
         <w:rPr>
           <w:rStyle w:val="VerbatimChar"/>
         </w:rPr>
-        <w:t xml:space="preserve">esp/hoftor</w:t>
+        <w:t xml:space="preserve">hw-hoftor</w:t>
       </w:r>
       <w:r>
         <w:t xml:space="preserve"> </w:t>
@@ -173,7 +147,17 @@
         <w:pStyle w:val="FirstParagraph"/>
       </w:pPr>
       <w:r>
-        <w:t xml:space="preserve">Der lokale Ausschalter (ABB) trennt</w:t>
+        <w:t xml:space="preserve">Der lokale Ausschalter (</w:t>
+      </w:r>
+      <w:r>
+        <w:rPr>
+          <w:b/>
+          <w:bCs/>
+        </w:rPr>
+        <w:t xml:space="preserve">Hager SBN225</w:t>
+      </w:r>
+      <w:r>
+        <w:t xml:space="preserve">, 2-pol., 25 A) trennt</w:t>
       </w:r>
       <w:r>
         <w:t xml:space="preserve"> </w:t>
@@ -1868,7 +1852,23 @@
               <w:pStyle w:val="Compact"/>
             </w:pPr>
             <w:r>
-              <w:t xml:space="preserve">von ESP r1 (später)</w:t>
+              <w:t xml:space="preserve">← CH1-NO</w:t>
+            </w:r>
+            <w:r>
+              <w:t xml:space="preserve"> </w:t>
+            </w:r>
+            <w:r>
+              <w:rPr>
+                <w:b/>
+                <w:bCs/>
+              </w:rPr>
+              <w:t xml:space="preserve">Grau</w:t>
+            </w:r>
+            <w:r>
+              <w:t xml:space="preserve"> </w:t>
+            </w:r>
+            <w:r>
+              <w:t xml:space="preserve">✓10-06</w:t>
             </w:r>
           </w:p>
         </w:tc>
@@ -1947,7 +1947,23 @@
               <w:pStyle w:val="Compact"/>
             </w:pPr>
             <w:r>
-              <w:t xml:space="preserve">von ESP r2 (später)</w:t>
+              <w:t xml:space="preserve">← CH2-NO</w:t>
+            </w:r>
+            <w:r>
+              <w:t xml:space="preserve"> </w:t>
+            </w:r>
+            <w:r>
+              <w:rPr>
+                <w:b/>
+                <w:bCs/>
+              </w:rPr>
+              <w:t xml:space="preserve">Grün</w:t>
+            </w:r>
+            <w:r>
+              <w:t xml:space="preserve"> </w:t>
+            </w:r>
+            <w:r>
+              <w:t xml:space="preserve">✓10-06</w:t>
             </w:r>
           </w:p>
         </w:tc>
@@ -2026,7 +2042,23 @@
               <w:pStyle w:val="Compact"/>
             </w:pPr>
             <w:r>
-              <w:t xml:space="preserve">von ESP r3 (später)</w:t>
+              <w:t xml:space="preserve">← CH3-NO</w:t>
+            </w:r>
+            <w:r>
+              <w:t xml:space="preserve"> </w:t>
+            </w:r>
+            <w:r>
+              <w:rPr>
+                <w:b/>
+                <w:bCs/>
+              </w:rPr>
+              <w:t xml:space="preserve">Weiß</w:t>
+            </w:r>
+            <w:r>
+              <w:t xml:space="preserve"> </w:t>
+            </w:r>
+            <w:r>
+              <w:t xml:space="preserve">✓10-06</w:t>
             </w:r>
           </w:p>
         </w:tc>
@@ -2105,7 +2137,23 @@
               <w:pStyle w:val="Compact"/>
             </w:pPr>
             <w:r>
-              <w:t xml:space="preserve">von ESP r4 (später)</w:t>
+              <w:t xml:space="preserve">← CH4-NO</w:t>
+            </w:r>
+            <w:r>
+              <w:t xml:space="preserve"> </w:t>
+            </w:r>
+            <w:r>
+              <w:rPr>
+                <w:b/>
+                <w:bCs/>
+              </w:rPr>
+              <w:t xml:space="preserve">Gelb</w:t>
+            </w:r>
+            <w:r>
+              <w:t xml:space="preserve"> </w:t>
+            </w:r>
+            <w:r>
+              <w:t xml:space="preserve">✓10-06</w:t>
             </w:r>
           </w:p>
         </w:tc>
@@ -2184,7 +2232,23 @@
               <w:pStyle w:val="Compact"/>
             </w:pPr>
             <w:r>
-              <w:t xml:space="preserve">von ESP r5 (später)</w:t>
+              <w:t xml:space="preserve">← CH5-NO</w:t>
+            </w:r>
+            <w:r>
+              <w:t xml:space="preserve"> </w:t>
+            </w:r>
+            <w:r>
+              <w:rPr>
+                <w:b/>
+                <w:bCs/>
+              </w:rPr>
+              <w:t xml:space="preserve">Rot</w:t>
+            </w:r>
+            <w:r>
+              <w:t xml:space="preserve"> </w:t>
+            </w:r>
+            <w:r>
+              <w:t xml:space="preserve">✓10-06</w:t>
             </w:r>
           </w:p>
         </w:tc>
@@ -2263,7 +2327,23 @@
               <w:pStyle w:val="Compact"/>
             </w:pPr>
             <w:r>
-              <w:t xml:space="preserve">von ESP r6 (später)</w:t>
+              <w:t xml:space="preserve">← CH6-NO</w:t>
+            </w:r>
+            <w:r>
+              <w:t xml:space="preserve"> </w:t>
+            </w:r>
+            <w:r>
+              <w:rPr>
+                <w:b/>
+                <w:bCs/>
+              </w:rPr>
+              <w:t xml:space="preserve">Rot</w:t>
+            </w:r>
+            <w:r>
+              <w:t xml:space="preserve"> </w:t>
+            </w:r>
+            <w:r>
+              <w:t xml:space="preserve">✓10-06</w:t>
             </w:r>
           </w:p>
         </w:tc>
@@ -4821,7 +4901,23 @@
         <w:t xml:space="preserve"> </w:t>
       </w:r>
       <w:r>
-        <w:t xml:space="preserve">(Waveshare in Reihe 1, PoE, VIN frei):</w:t>
+        <w:t xml:space="preserve">(Waveshare in Reihe 1, PoE, VIN frei). Relais-Klemmen je Kanal</w:t>
+      </w:r>
+      <w:r>
+        <w:t xml:space="preserve"> </w:t>
+      </w:r>
+      <w:r>
+        <w:rPr>
+          <w:b/>
+          <w:bCs/>
+        </w:rPr>
+        <w:t xml:space="preserve">NO–COM–NC</w:t>
+      </w:r>
+      <w:r>
+        <w:t xml:space="preserve"> </w:t>
+      </w:r>
+      <w:r>
+        <w:t xml:space="preserve">(COM mittig, am Aufdruck verifiziert; NO = linke Klemme, NC frei). Kanäle CH1=r1 … CH6=r6 (final erst nach Flash testen).</w:t>
       </w:r>
     </w:p>
     <w:p>
@@ -4833,113 +4929,17 @@
         </w:numPr>
       </w:pPr>
       <w:r>
-        <w:t xml:space="preserve">A1 von R11–R16 ← Onboard-Relais r1–r6 (geschaltetes +24 V, schwarz)</w:t>
-      </w:r>
-    </w:p>
-    <w:p>
-      <w:pPr>
-        <w:pStyle w:val="Compact"/>
-        <w:numPr>
-          <w:ilvl w:val="0"/>
-          <w:numId w:val="1006"/>
-        </w:numPr>
-      </w:pPr>
-      <w:r>
-        <w:t xml:space="preserve">Onboard-Relais-COMs (r1–r6) ← +24 V (R-Block)</w:t>
-      </w:r>
-    </w:p>
-    <w:p>
-      <w:pPr>
-        <w:pStyle w:val="Compact"/>
-        <w:numPr>
-          <w:ilvl w:val="0"/>
-          <w:numId w:val="1006"/>
-        </w:numPr>
-      </w:pPr>
-      <w:r>
-        <w:t xml:space="preserve">K14 von R17→DI1, R18→DI2, R19→DI3</w:t>
-      </w:r>
-    </w:p>
-    <w:p>
-      <w:pPr>
-        <w:pStyle w:val="Compact"/>
-        <w:numPr>
-          <w:ilvl w:val="0"/>
-          <w:numId w:val="1006"/>
-        </w:numPr>
-      </w:pPr>
-      <w:r>
-        <w:t xml:space="preserve">ESP DI-COM → GND (Bl-Block) — Pflicht</w:t>
-      </w:r>
-    </w:p>
-    <w:p>
-      <w:pPr>
-        <w:pStyle w:val="Compact"/>
-        <w:numPr>
-          <w:ilvl w:val="0"/>
-          <w:numId w:val="1006"/>
-        </w:numPr>
-      </w:pPr>
-      <w:r>
-        <w:t xml:space="preserve">PoE-Cat-Kabel an ESP-RJ45</w:t>
-      </w:r>
-    </w:p>
-    <w:p>
-      <w:pPr>
-        <w:pStyle w:val="FirstParagraph"/>
-      </w:pPr>
-      <w:r>
-        <w:t xml:space="preserve">⚠️</w:t>
-      </w:r>
-      <w:r>
-        <w:t xml:space="preserve"> </w:t>
-      </w:r>
-      <w:r>
         <w:rPr>
           <w:b/>
           <w:bCs/>
         </w:rPr>
-        <w:t xml:space="preserve">Freischalten:</w:t>
-      </w:r>
-      <w:r>
-        <w:t xml:space="preserve"> </w:t>
-      </w:r>
-      <w:r>
-        <w:t xml:space="preserve">siehe Sicherheitshinweis am Dokumentanfang — der Ausschalter trennt nur den 24-V-Kreis;</w:t>
-      </w:r>
-      <w:r>
-        <w:t xml:space="preserve"> </w:t>
-      </w:r>
-      <w:r>
-        <w:rPr>
-          <w:b/>
-          <w:bCs/>
-        </w:rPr>
-        <w:t xml:space="preserve">ESP (PoE) und BFT (eigene 230-V-Versorgung) bleiben unabhängig spannungsführend</w:t>
-      </w:r>
-      <w:r>
-        <w:t xml:space="preserve"> </w:t>
-      </w:r>
-      <w:r>
-        <w:t xml:space="preserve">(BFT speist die Klemmen 1–10).</w:t>
-      </w:r>
-    </w:p>
-    <w:p>
-      <w:pPr>
-        <w:pStyle w:val="BodyText"/>
-      </w:pPr>
-      <w:r>
-        <w:rPr>
-          <w:b/>
-          <w:bCs/>
-        </w:rPr>
-        <w:t xml:space="preserve">B) Geräteseite Block C</w:t>
-      </w:r>
-      <w:r>
-        <w:t xml:space="preserve"> </w:t>
-      </w:r>
-      <w:r>
-        <w:t xml:space="preserve">(-U):</w:t>
+        <w:t xml:space="preserve">Onboard-Relais-COMs CH1–CH6 ← +24 V (R-Block, rot)</w:t>
+      </w:r>
+      <w:r>
+        <w:t xml:space="preserve"> </w:t>
+      </w:r>
+      <w:r>
+        <w:t xml:space="preserve">— verdrahtet 10-06-2026: CH1←R-c · CH2←R-e · CH3←R-g · CH4←R-i · CH5←R-k · CH6←R-m</w:t>
       </w:r>
     </w:p>
     <w:p>
@@ -4951,43 +4951,129 @@
         </w:numPr>
       </w:pPr>
       <w:r>
-        <w:t xml:space="preserve">LED blau: + → 21-U, − → 23-U</w:t>
-      </w:r>
-    </w:p>
-    <w:p>
-      <w:pPr>
-        <w:pStyle w:val="Compact"/>
-        <w:numPr>
-          <w:ilvl w:val="0"/>
-          <w:numId w:val="1007"/>
-        </w:numPr>
-      </w:pPr>
-      <w:r>
-        <w:t xml:space="preserve">LED rot: + → 22-U, − → 24-U</w:t>
-      </w:r>
-    </w:p>
-    <w:p>
-      <w:pPr>
-        <w:pStyle w:val="Compact"/>
-        <w:numPr>
-          <w:ilvl w:val="0"/>
-          <w:numId w:val="1007"/>
-        </w:numPr>
-      </w:pPr>
-      <w:r>
-        <w:t xml:space="preserve">Taster: Bein 1 → 25-U, Bein 2 → 26-U</w:t>
-      </w:r>
-    </w:p>
-    <w:p>
-      <w:pPr>
-        <w:pStyle w:val="FirstParagraph"/>
-      </w:pPr>
-      <w:r>
         <w:rPr>
           <w:b/>
           <w:bCs/>
         </w:rPr>
-        <w:t xml:space="preserve">C) Tor-Seite — AHK-Adern auf -U der Klemmen 1–10:</w:t>
+        <w:t xml:space="preserve">NO CH1–CH6 → A1 von R11–R16</w:t>
+      </w:r>
+      <w:r>
+        <w:t xml:space="preserve"> </w:t>
+      </w:r>
+      <w:r>
+        <w:t xml:space="preserve">— verdrahtet 10-06-2026.</w:t>
+      </w:r>
+      <w:r>
+        <w:t xml:space="preserve"> </w:t>
+      </w:r>
+      <w:r>
+        <w:rPr>
+          <w:b/>
+          <w:bCs/>
+        </w:rPr>
+        <w:t xml:space="preserve">Antriebsfarbe = Funktionsfarbe des Kanals</w:t>
+      </w:r>
+      <w:r>
+        <w:t xml:space="preserve"> </w:t>
+      </w:r>
+      <w:r>
+        <w:t xml:space="preserve">(durchgängig BFT→Waveshare; ersetzt frühere „schwarz”-Festlegung, da Schwarz = COM-Haupt): R11</w:t>
+      </w:r>
+      <w:r>
+        <w:t xml:space="preserve"> </w:t>
+      </w:r>
+      <w:r>
+        <w:rPr>
+          <w:b/>
+          <w:bCs/>
+        </w:rPr>
+        <w:t xml:space="preserve">Grau</w:t>
+      </w:r>
+      <w:r>
+        <w:t xml:space="preserve"> </w:t>
+      </w:r>
+      <w:r>
+        <w:t xml:space="preserve">· R12</w:t>
+      </w:r>
+      <w:r>
+        <w:t xml:space="preserve"> </w:t>
+      </w:r>
+      <w:r>
+        <w:rPr>
+          <w:b/>
+          <w:bCs/>
+        </w:rPr>
+        <w:t xml:space="preserve">Grün</w:t>
+      </w:r>
+      <w:r>
+        <w:t xml:space="preserve"> </w:t>
+      </w:r>
+      <w:r>
+        <w:t xml:space="preserve">· R13</w:t>
+      </w:r>
+      <w:r>
+        <w:t xml:space="preserve"> </w:t>
+      </w:r>
+      <w:r>
+        <w:rPr>
+          <w:b/>
+          <w:bCs/>
+        </w:rPr>
+        <w:t xml:space="preserve">Weiß</w:t>
+      </w:r>
+      <w:r>
+        <w:t xml:space="preserve"> </w:t>
+      </w:r>
+      <w:r>
+        <w:t xml:space="preserve">· R14</w:t>
+      </w:r>
+      <w:r>
+        <w:t xml:space="preserve"> </w:t>
+      </w:r>
+      <w:r>
+        <w:rPr>
+          <w:b/>
+          <w:bCs/>
+        </w:rPr>
+        <w:t xml:space="preserve">Gelb</w:t>
+      </w:r>
+      <w:r>
+        <w:t xml:space="preserve"> </w:t>
+      </w:r>
+      <w:r>
+        <w:t xml:space="preserve">· R15</w:t>
+      </w:r>
+      <w:r>
+        <w:t xml:space="preserve"> </w:t>
+      </w:r>
+      <w:r>
+        <w:rPr>
+          <w:b/>
+          <w:bCs/>
+        </w:rPr>
+        <w:t xml:space="preserve">Rot</w:t>
+      </w:r>
+      <w:r>
+        <w:t xml:space="preserve"> </w:t>
+      </w:r>
+      <w:r>
+        <w:t xml:space="preserve">· R16</w:t>
+      </w:r>
+      <w:r>
+        <w:t xml:space="preserve"> </w:t>
+      </w:r>
+      <w:r>
+        <w:rPr>
+          <w:b/>
+          <w:bCs/>
+        </w:rPr>
+        <w:t xml:space="preserve">Rot</w:t>
+      </w:r>
+      <w:r>
+        <w:t xml:space="preserve"> </w:t>
+      </w:r>
+      <w:r>
+        <w:t xml:space="preserve">(LEDs rot = +24-V-Antrieb ohne BFT-Funktionsfarbe).</w:t>
       </w:r>
     </w:p>
     <w:p>
@@ -4999,19 +5085,37 @@
         </w:numPr>
       </w:pPr>
       <w:r>
-        <w:t xml:space="preserve">1-U Schwarz←BFT 60 · 2-U Gelb←61 · 3-U Grün←62 · 4-U Braun←63 · 5-U Weiß←64 · 6-U Grau←65 · 7-U Rot←24 · 8-U Rosa←26 · 9-U (offen)→25 · 10-U Weiß-Blau→27</w:t>
-      </w:r>
-    </w:p>
-    <w:p>
-      <w:pPr>
-        <w:pStyle w:val="FirstParagraph"/>
-      </w:pPr>
+        <w:t xml:space="preserve">K14 von R17→DI1 (</w:t>
+      </w:r>
       <w:r>
         <w:rPr>
           <w:b/>
           <w:bCs/>
         </w:rPr>
-        <w:t xml:space="preserve">D) 230 V + 24 V-Versorgung:</w:t>
+        <w:t xml:space="preserve">rot</w:t>
+      </w:r>
+      <w:r>
+        <w:t xml:space="preserve">), R18→DI2 (</w:t>
+      </w:r>
+      <w:r>
+        <w:rPr>
+          <w:b/>
+          <w:bCs/>
+        </w:rPr>
+        <w:t xml:space="preserve">rosa</w:t>
+      </w:r>
+      <w:r>
+        <w:t xml:space="preserve">), R19→DI3 (</w:t>
+      </w:r>
+      <w:r>
+        <w:rPr>
+          <w:b/>
+          <w:bCs/>
+        </w:rPr>
+        <w:t xml:space="preserve">weiß-schwarz</w:t>
+      </w:r>
+      <w:r>
+        <w:t xml:space="preserve">) — Funktionsfarbe durchgezogen</w:t>
       </w:r>
     </w:p>
     <w:p>
@@ -5023,19 +5127,7 @@
         </w:numPr>
       </w:pPr>
       <w:r>
-        <w:t xml:space="preserve">230 V L/N/PE (Block B) einführen</w:t>
-      </w:r>
-    </w:p>
-    <w:p>
-      <w:pPr>
-        <w:pStyle w:val="Compact"/>
-        <w:numPr>
-          <w:ilvl w:val="0"/>
-          <w:numId w:val="1009"/>
-        </w:numPr>
-      </w:pPr>
-      <w:r>
-        <w:t xml:space="preserve">24-V-Netzteil</w:t>
+        <w:t xml:space="preserve">ESP DI-COM → GND (Bl-Block, blau) — Pflicht. ⚠️ DI-Header hat</w:t>
       </w:r>
       <w:r>
         <w:t xml:space="preserve"> </w:t>
@@ -5045,150 +5137,33 @@
           <w:b/>
           <w:bCs/>
         </w:rPr>
-        <w:t xml:space="preserve">Phoenix 0,63 A / 15 W</w:t>
-      </w:r>
-      <w:r>
-        <w:t xml:space="preserve"> </w:t>
-      </w:r>
-      <w:r>
-        <w:t xml:space="preserve">auf Hutschiene (Reihe 1) — ESP hängt per PoE NICHT am PSU</w:t>
-      </w:r>
-    </w:p>
-    <w:p>
-      <w:pPr>
-        <w:pStyle w:val="Compact"/>
-        <w:numPr>
-          <w:ilvl w:val="0"/>
-          <w:numId w:val="1009"/>
-        </w:numPr>
-      </w:pPr>
+        <w:t xml:space="preserve">COM</w:t>
+      </w:r>
+      <w:r>
+        <w:t xml:space="preserve"> </w:t>
+      </w:r>
+      <w:r>
+        <w:rPr>
+          <w:i/>
+          <w:iCs/>
+        </w:rPr>
+        <w:t xml:space="preserve">und</w:t>
+      </w:r>
+      <w:r>
+        <w:t xml:space="preserve"> </w:t>
+      </w:r>
       <w:r>
         <w:rPr>
           <w:b/>
           <w:bCs/>
         </w:rPr>
-        <w:t xml:space="preserve">27-U → R-a</w:t>
-      </w:r>
-      <w:r>
-        <w:t xml:space="preserve"> </w:t>
-      </w:r>
-      <w:r>
-        <w:t xml:space="preserve">✓ verdrahtet (Rot 0,5 mm²) · offen:</w:t>
-      </w:r>
-      <w:r>
-        <w:t xml:space="preserve"> </w:t>
-      </w:r>
-      <w:r>
-        <w:rPr>
-          <w:b/>
-          <w:bCs/>
-        </w:rPr>
-        <w:t xml:space="preserve">PSU+ → 27-O</w:t>
-      </w:r>
-      <w:r>
-        <w:t xml:space="preserve"> </w:t>
-      </w:r>
-      <w:r>
-        <w:t xml:space="preserve">+</w:t>
-      </w:r>
-      <w:r>
-        <w:t xml:space="preserve"> </w:t>
-      </w:r>
-      <w:r>
-        <w:rPr>
-          <w:b/>
-          <w:bCs/>
-        </w:rPr>
-        <w:t xml:space="preserve">Sicherung 1 A T stecken</w:t>
-      </w:r>
-      <w:r>
-        <w:t xml:space="preserve"> </w:t>
-      </w:r>
-      <w:r>
-        <w:t xml:space="preserve">(Sicherung bleibt bis Inbetriebnahme draußen → +24-V-Kreis spannungslos). Polarität egal — antiparallele LED in der HESILED.</w:t>
-      </w:r>
-    </w:p>
-    <w:p>
-      <w:pPr>
-        <w:pStyle w:val="Compact"/>
-        <w:numPr>
-          <w:ilvl w:val="0"/>
-          <w:numId w:val="1009"/>
-        </w:numPr>
-      </w:pPr>
-      <w:r>
-        <w:rPr>
-          <w:b/>
-          <w:bCs/>
-        </w:rPr>
-        <w:t xml:space="preserve">PSU− → Bl-a</w:t>
-      </w:r>
-      <w:r>
-        <w:t xml:space="preserve"> </w:t>
-      </w:r>
-      <w:r>
-        <w:t xml:space="preserve">(GND,</w:t>
-      </w:r>
-      <w:r>
-        <w:t xml:space="preserve"> </w:t>
-      </w:r>
-      <w:r>
-        <w:rPr>
-          <w:b/>
-          <w:bCs/>
-        </w:rPr>
-        <w:t xml:space="preserve">ungesichert</w:t>
-      </w:r>
-      <w:r>
-        <w:t xml:space="preserve"> </w:t>
-      </w:r>
-      <w:r>
-        <w:t xml:space="preserve">— 0-V-Rückleiter nie absichern)</w:t>
-      </w:r>
-    </w:p>
-    <w:p>
-      <w:pPr>
-        <w:pStyle w:val="Compact"/>
-        <w:numPr>
-          <w:ilvl w:val="0"/>
-          <w:numId w:val="1009"/>
-        </w:numPr>
-      </w:pPr>
-      <w:r>
-        <w:t xml:space="preserve">Sicherung 28 =</w:t>
-      </w:r>
-      <w:r>
-        <w:t xml:space="preserve"> </w:t>
-      </w:r>
-      <w:r>
-        <w:rPr>
-          <w:b/>
-          <w:bCs/>
-        </w:rPr>
-        <w:t xml:space="preserve">+24-V-Reserve</w:t>
-      </w:r>
-      <w:r>
-        <w:t xml:space="preserve"> </w:t>
-      </w:r>
-      <w:r>
-        <w:t xml:space="preserve">(leer)</w:t>
-      </w:r>
-    </w:p>
-    <w:p>
-      <w:r>
-        <w:pict>
-          <v:rect style="width:0;height:1.5pt" o:hralign="center" o:hrstd="t" o:hr="t"/>
-        </w:pict>
-      </w:r>
-    </w:p>
-    <w:bookmarkEnd w:id="22"/>
-    <w:bookmarkStart w:id="23" w:name="querverweise"/>
-    <w:p>
-      <w:pPr>
-        <w:pStyle w:val="Heading2"/>
-      </w:pPr>
-      <w:r>
-        <w:t xml:space="preserve">14. Querverweise</w:t>
+        <w:t xml:space="preserve">DGND</w:t>
+      </w:r>
+      <w:r>
+        <w:t xml:space="preserve"> </w:t>
+      </w:r>
+      <w:r>
+        <w:t xml:space="preserve">— vor dem Auflegen klären, welcher der isolierte Eingangs-COM ist.</w:t>
       </w:r>
     </w:p>
     <w:p>
@@ -5200,20 +5175,65 @@
         </w:numPr>
       </w:pPr>
       <w:r>
+        <w:t xml:space="preserve">PoE-Cat-Kabel an ESP-RJ45</w:t>
+      </w:r>
+    </w:p>
+    <w:p>
+      <w:pPr>
+        <w:pStyle w:val="FirstParagraph"/>
+      </w:pPr>
+      <w:r>
+        <w:t xml:space="preserve">⚠️</w:t>
+      </w:r>
+      <w:r>
+        <w:t xml:space="preserve"> </w:t>
+      </w:r>
+      <w:r>
         <w:rPr>
           <w:b/>
           <w:bCs/>
         </w:rPr>
-        <w:t xml:space="preserve">Firmware-/Software-Logik (ESPHome):</w:t>
-      </w:r>
-      <w:r>
-        <w:t xml:space="preserve"> </w:t>
-      </w:r>
-      <w:r>
-        <w:rPr>
-          <w:rStyle w:val="VerbatimChar"/>
-        </w:rPr>
-        <w:t xml:space="preserve">Hoftor_Dokumentation_v0.35.docx</w:t>
+        <w:t xml:space="preserve">Freischalten:</w:t>
+      </w:r>
+      <w:r>
+        <w:t xml:space="preserve"> </w:t>
+      </w:r>
+      <w:r>
+        <w:t xml:space="preserve">siehe Sicherheitshinweis am Dokumentanfang — der Ausschalter trennt nur den 24-V-Kreis;</w:t>
+      </w:r>
+      <w:r>
+        <w:t xml:space="preserve"> </w:t>
+      </w:r>
+      <w:r>
+        <w:rPr>
+          <w:b/>
+          <w:bCs/>
+        </w:rPr>
+        <w:t xml:space="preserve">ESP (PoE) und BFT (eigene 230-V-Versorgung) bleiben unabhängig spannungsführend</w:t>
+      </w:r>
+      <w:r>
+        <w:t xml:space="preserve"> </w:t>
+      </w:r>
+      <w:r>
+        <w:t xml:space="preserve">(BFT speist die Klemmen 1–10).</w:t>
+      </w:r>
+    </w:p>
+    <w:p>
+      <w:pPr>
+        <w:pStyle w:val="BodyText"/>
+      </w:pPr>
+      <w:r>
+        <w:rPr>
+          <w:b/>
+          <w:bCs/>
+        </w:rPr>
+        <w:t xml:space="preserve">B) Geräteseite Block C</w:t>
+      </w:r>
+      <w:r>
+        <w:t xml:space="preserve"> </w:t>
+      </w:r>
+      <w:r>
+        <w:t xml:space="preserve">(-U):</w:t>
       </w:r>
     </w:p>
     <w:p>
@@ -5221,39 +5241,11 @@
         <w:pStyle w:val="Compact"/>
         <w:numPr>
           <w:ilvl w:val="0"/>
-          <w:numId w:val="1010"/>
+          <w:numId w:val="1011"/>
         </w:numPr>
       </w:pPr>
       <w:r>
-        <w:rPr>
-          <w:b/>
-          <w:bCs/>
-        </w:rPr>
-        <w:t xml:space="preserve">Live-Arbeitsdoku / vollständiger Stand:</w:t>
-      </w:r>
-      <w:r>
-        <w:t xml:space="preserve"> </w:t>
-      </w:r>
-      <w:r>
-        <w:rPr>
-          <w:rStyle w:val="VerbatimChar"/>
-        </w:rPr>
-        <w:t xml:space="preserve">CLAUDE.md</w:t>
-      </w:r>
-      <w:r>
-        <w:t xml:space="preserve"> </w:t>
-      </w:r>
-      <w:r>
-        <w:t xml:space="preserve">(</w:t>
-      </w:r>
-      <w:r>
-        <w:rPr>
-          <w:rStyle w:val="VerbatimChar"/>
-        </w:rPr>
-        <w:t xml:space="preserve">esp/hoftor</w:t>
-      </w:r>
-      <w:r>
-        <w:t xml:space="preserve">, Abschnitt §6a)</w:t>
+        <w:t xml:space="preserve">LED blau: + → 21-U, − → 23-U</w:t>
       </w:r>
     </w:p>
     <w:p>
@@ -5261,7 +5253,337 @@
         <w:pStyle w:val="Compact"/>
         <w:numPr>
           <w:ilvl w:val="0"/>
-          <w:numId w:val="1010"/>
+          <w:numId w:val="1011"/>
+        </w:numPr>
+      </w:pPr>
+      <w:r>
+        <w:t xml:space="preserve">LED rot: + → 22-U, − → 24-U</w:t>
+      </w:r>
+    </w:p>
+    <w:p>
+      <w:pPr>
+        <w:pStyle w:val="Compact"/>
+        <w:numPr>
+          <w:ilvl w:val="0"/>
+          <w:numId w:val="1011"/>
+        </w:numPr>
+      </w:pPr>
+      <w:r>
+        <w:t xml:space="preserve">Taster: Bein 1 → 25-U, Bein 2 → 26-U</w:t>
+      </w:r>
+    </w:p>
+    <w:p>
+      <w:pPr>
+        <w:pStyle w:val="FirstParagraph"/>
+      </w:pPr>
+      <w:r>
+        <w:rPr>
+          <w:b/>
+          <w:bCs/>
+        </w:rPr>
+        <w:t xml:space="preserve">C) Tor-Seite — AHK-Adern auf -U der Klemmen 1–10:</w:t>
+      </w:r>
+    </w:p>
+    <w:p>
+      <w:pPr>
+        <w:pStyle w:val="Compact"/>
+        <w:numPr>
+          <w:ilvl w:val="0"/>
+          <w:numId w:val="1012"/>
+        </w:numPr>
+      </w:pPr>
+      <w:r>
+        <w:t xml:space="preserve">1-U Schwarz←BFT 60 · 2-U Gelb←61 · 3-U Grün←62 · 4-U Braun←63 · 5-U Weiß←64 · 6-U Grau←65 · 7-U Rot←24 · 8-U Rosa←26 · 9-U (offen)→25 · 10-U Weiß-Blau→27</w:t>
+      </w:r>
+    </w:p>
+    <w:p>
+      <w:pPr>
+        <w:pStyle w:val="FirstParagraph"/>
+      </w:pPr>
+      <w:r>
+        <w:rPr>
+          <w:b/>
+          <w:bCs/>
+        </w:rPr>
+        <w:t xml:space="preserve">D) 230 V + 24 V-Versorgung:</w:t>
+      </w:r>
+    </w:p>
+    <w:p>
+      <w:pPr>
+        <w:pStyle w:val="Compact"/>
+        <w:numPr>
+          <w:ilvl w:val="0"/>
+          <w:numId w:val="1013"/>
+        </w:numPr>
+      </w:pPr>
+      <w:r>
+        <w:t xml:space="preserve">☒ 230 V L/N/PE (Block B) einführen →</w:t>
+      </w:r>
+      <w:r>
+        <w:t xml:space="preserve"> </w:t>
+      </w:r>
+      <w:r>
+        <w:rPr>
+          <w:b/>
+          <w:bCs/>
+        </w:rPr>
+        <w:t xml:space="preserve">Hager SBN225</w:t>
+      </w:r>
+      <w:r>
+        <w:t xml:space="preserve"> </w:t>
+      </w:r>
+      <w:r>
+        <w:t xml:space="preserve">(2-pol., 25 A) → PSU-Eingang (10-06-2026)</w:t>
+      </w:r>
+    </w:p>
+    <w:p>
+      <w:pPr>
+        <w:pStyle w:val="Compact"/>
+        <w:numPr>
+          <w:ilvl w:val="0"/>
+          <w:numId w:val="1013"/>
+        </w:numPr>
+      </w:pPr>
+      <w:r>
+        <w:t xml:space="preserve">☒ 24-V-Netzteil</w:t>
+      </w:r>
+      <w:r>
+        <w:t xml:space="preserve"> </w:t>
+      </w:r>
+      <w:r>
+        <w:rPr>
+          <w:b/>
+          <w:bCs/>
+        </w:rPr>
+        <w:t xml:space="preserve">Phoenix STEP POWER 1088495</w:t>
+      </w:r>
+      <w:r>
+        <w:t xml:space="preserve"> </w:t>
+      </w:r>
+      <w:r>
+        <w:t xml:space="preserve">(24 V/0,63 A) auf Hutschiene (Reihe 1) — ESP hängt per PoE NICHT am PSU — verbaut 10-06-2026</w:t>
+      </w:r>
+    </w:p>
+    <w:p>
+      <w:pPr>
+        <w:pStyle w:val="Compact"/>
+        <w:numPr>
+          <w:ilvl w:val="0"/>
+          <w:numId w:val="1013"/>
+        </w:numPr>
+      </w:pPr>
+      <w:r>
+        <w:t xml:space="preserve">☒</w:t>
+      </w:r>
+      <w:r>
+        <w:t xml:space="preserve"> </w:t>
+      </w:r>
+      <w:r>
+        <w:rPr>
+          <w:b/>
+          <w:bCs/>
+        </w:rPr>
+        <w:t xml:space="preserve">27-U → R-a</w:t>
+      </w:r>
+      <w:r>
+        <w:t xml:space="preserve"> </w:t>
+      </w:r>
+      <w:r>
+        <w:t xml:space="preserve">verdrahtet (Rot 0,5 mm²) ·</w:t>
+      </w:r>
+      <w:r>
+        <w:t xml:space="preserve"> </w:t>
+      </w:r>
+      <w:r>
+        <w:rPr>
+          <w:b/>
+          <w:bCs/>
+        </w:rPr>
+        <w:t xml:space="preserve">PSU+ → 27-O</w:t>
+      </w:r>
+      <w:r>
+        <w:t xml:space="preserve"> </w:t>
+      </w:r>
+      <w:r>
+        <w:t xml:space="preserve">verdrahtet 10-06-2026. ⚠️</w:t>
+      </w:r>
+      <w:r>
+        <w:t xml:space="preserve"> </w:t>
+      </w:r>
+      <w:r>
+        <w:rPr>
+          <w:b/>
+          <w:bCs/>
+        </w:rPr>
+        <w:t xml:space="preserve">Glassicherung 1 A T noch bestätigen, ob gesteckt</w:t>
+      </w:r>
+      <w:r>
+        <w:t xml:space="preserve"> </w:t>
+      </w:r>
+      <w:r>
+        <w:t xml:space="preserve">(Plan: erst bei Inbetriebnahme → +24-V-Kreis bleibt beim Aufbau spannungslos). Polarität egal — antiparallele LED in der HESILED.</w:t>
+      </w:r>
+    </w:p>
+    <w:p>
+      <w:pPr>
+        <w:pStyle w:val="Compact"/>
+        <w:numPr>
+          <w:ilvl w:val="0"/>
+          <w:numId w:val="1013"/>
+        </w:numPr>
+      </w:pPr>
+      <w:r>
+        <w:t xml:space="preserve">☒</w:t>
+      </w:r>
+      <w:r>
+        <w:t xml:space="preserve"> </w:t>
+      </w:r>
+      <w:r>
+        <w:rPr>
+          <w:b/>
+          <w:bCs/>
+        </w:rPr>
+        <w:t xml:space="preserve">PSU− → Bl-a</w:t>
+      </w:r>
+      <w:r>
+        <w:t xml:space="preserve"> </w:t>
+      </w:r>
+      <w:r>
+        <w:t xml:space="preserve">(GND,</w:t>
+      </w:r>
+      <w:r>
+        <w:t xml:space="preserve"> </w:t>
+      </w:r>
+      <w:r>
+        <w:rPr>
+          <w:b/>
+          <w:bCs/>
+        </w:rPr>
+        <w:t xml:space="preserve">ungesichert</w:t>
+      </w:r>
+      <w:r>
+        <w:t xml:space="preserve"> </w:t>
+      </w:r>
+      <w:r>
+        <w:t xml:space="preserve">— 0-V-Rückleiter nie absichern) — verdrahtet 10-06-2026</w:t>
+      </w:r>
+    </w:p>
+    <w:p>
+      <w:pPr>
+        <w:pStyle w:val="Compact"/>
+        <w:numPr>
+          <w:ilvl w:val="0"/>
+          <w:numId w:val="1013"/>
+        </w:numPr>
+      </w:pPr>
+      <w:r>
+        <w:t xml:space="preserve">Sicherung 28 =</w:t>
+      </w:r>
+      <w:r>
+        <w:t xml:space="preserve"> </w:t>
+      </w:r>
+      <w:r>
+        <w:rPr>
+          <w:b/>
+          <w:bCs/>
+        </w:rPr>
+        <w:t xml:space="preserve">+24-V-Reserve</w:t>
+      </w:r>
+      <w:r>
+        <w:t xml:space="preserve"> </w:t>
+      </w:r>
+      <w:r>
+        <w:t xml:space="preserve">(leer)</w:t>
+      </w:r>
+    </w:p>
+    <w:p>
+      <w:r>
+        <w:pict>
+          <v:rect style="width:0;height:1.5pt" o:hralign="center" o:hrstd="t" o:hr="t"/>
+        </w:pict>
+      </w:r>
+    </w:p>
+    <w:bookmarkEnd w:id="22"/>
+    <w:bookmarkStart w:id="23" w:name="querverweise"/>
+    <w:p>
+      <w:pPr>
+        <w:pStyle w:val="Heading2"/>
+      </w:pPr>
+      <w:r>
+        <w:t xml:space="preserve">14. Querverweise</w:t>
+      </w:r>
+    </w:p>
+    <w:p>
+      <w:pPr>
+        <w:pStyle w:val="Compact"/>
+        <w:numPr>
+          <w:ilvl w:val="0"/>
+          <w:numId w:val="1014"/>
+        </w:numPr>
+      </w:pPr>
+      <w:r>
+        <w:rPr>
+          <w:b/>
+          <w:bCs/>
+        </w:rPr>
+        <w:t xml:space="preserve">Firmware-/Software-Logik (ESPHome):</w:t>
+      </w:r>
+      <w:r>
+        <w:t xml:space="preserve"> </w:t>
+      </w:r>
+      <w:r>
+        <w:rPr>
+          <w:rStyle w:val="VerbatimChar"/>
+        </w:rPr>
+        <w:t xml:space="preserve">Hoftor_Dokumentation_v0.35.docx</w:t>
+      </w:r>
+    </w:p>
+    <w:p>
+      <w:pPr>
+        <w:pStyle w:val="Compact"/>
+        <w:numPr>
+          <w:ilvl w:val="0"/>
+          <w:numId w:val="1014"/>
+        </w:numPr>
+      </w:pPr>
+      <w:r>
+        <w:rPr>
+          <w:b/>
+          <w:bCs/>
+        </w:rPr>
+        <w:t xml:space="preserve">Live-Arbeitsdoku / vollständiger Stand:</w:t>
+      </w:r>
+      <w:r>
+        <w:t xml:space="preserve"> </w:t>
+      </w:r>
+      <w:r>
+        <w:rPr>
+          <w:rStyle w:val="VerbatimChar"/>
+        </w:rPr>
+        <w:t xml:space="preserve">CLAUDE.md</w:t>
+      </w:r>
+      <w:r>
+        <w:t xml:space="preserve"> </w:t>
+      </w:r>
+      <w:r>
+        <w:t xml:space="preserve">(</w:t>
+      </w:r>
+      <w:r>
+        <w:rPr>
+          <w:rStyle w:val="VerbatimChar"/>
+        </w:rPr>
+        <w:t xml:space="preserve">hw-hoftor</w:t>
+      </w:r>
+      <w:r>
+        <w:t xml:space="preserve">, Abschnitt §6a)</w:t>
+      </w:r>
+    </w:p>
+    <w:p>
+      <w:pPr>
+        <w:pStyle w:val="Compact"/>
+        <w:numPr>
+          <w:ilvl w:val="0"/>
+          <w:numId w:val="1014"/>
         </w:numPr>
       </w:pPr>
       <w:r>
@@ -5581,6 +5903,158 @@
       <w:start w:val="1"/>
       <w:numFmt w:val="decimal"/>
       <w:lvlText w:val="%9."/>
+      <w:lvlJc w:val="left"/>
+      <w:pPr>
+        <w:ind w:left="6480" w:hanging="360"/>
+      </w:pPr>
+    </w:lvl>
+  </w:abstractNum>
+  <w:abstractNum w:abstractNumId="993">
+    <w:nsid w:val="0000A993"/>
+    <w:multiLevelType w:val="multilevel"/>
+    <w:lvl w:ilvl="0">
+      <w:numFmt w:val="bullet"/>
+      <w:lvlText w:val="☒"/>
+      <w:lvlJc w:val="left"/>
+      <w:pPr>
+        <w:ind w:left="720" w:hanging="360"/>
+      </w:pPr>
+    </w:lvl>
+    <w:lvl w:ilvl="1">
+      <w:numFmt w:val="bullet"/>
+      <w:lvlText w:val="☒"/>
+      <w:lvlJc w:val="left"/>
+      <w:pPr>
+        <w:ind w:left="1440" w:hanging="360"/>
+      </w:pPr>
+    </w:lvl>
+    <w:lvl w:ilvl="2">
+      <w:numFmt w:val="bullet"/>
+      <w:lvlText w:val="☒"/>
+      <w:lvlJc w:val="left"/>
+      <w:pPr>
+        <w:ind w:left="2160" w:hanging="360"/>
+      </w:pPr>
+    </w:lvl>
+    <w:lvl w:ilvl="3">
+      <w:numFmt w:val="bullet"/>
+      <w:lvlText w:val="☒"/>
+      <w:lvlJc w:val="left"/>
+      <w:pPr>
+        <w:ind w:left="2880" w:hanging="360"/>
+      </w:pPr>
+    </w:lvl>
+    <w:lvl w:ilvl="4">
+      <w:numFmt w:val="bullet"/>
+      <w:lvlText w:val="☒"/>
+      <w:lvlJc w:val="left"/>
+      <w:pPr>
+        <w:ind w:left="3600" w:hanging="360"/>
+      </w:pPr>
+    </w:lvl>
+    <w:lvl w:ilvl="5">
+      <w:numFmt w:val="bullet"/>
+      <w:lvlText w:val="☒"/>
+      <w:lvlJc w:val="left"/>
+      <w:pPr>
+        <w:ind w:left="4320" w:hanging="360"/>
+      </w:pPr>
+    </w:lvl>
+    <w:lvl w:ilvl="6">
+      <w:numFmt w:val="bullet"/>
+      <w:lvlText w:val="☒"/>
+      <w:lvlJc w:val="left"/>
+      <w:pPr>
+        <w:ind w:left="5040" w:hanging="360"/>
+      </w:pPr>
+    </w:lvl>
+    <w:lvl w:ilvl="7">
+      <w:numFmt w:val="bullet"/>
+      <w:lvlText w:val="☒"/>
+      <w:lvlJc w:val="left"/>
+      <w:pPr>
+        <w:ind w:left="5760" w:hanging="360"/>
+      </w:pPr>
+    </w:lvl>
+    <w:lvl w:ilvl="8">
+      <w:numFmt w:val="bullet"/>
+      <w:lvlText w:val="☒"/>
+      <w:lvlJc w:val="left"/>
+      <w:pPr>
+        <w:ind w:left="6480" w:hanging="360"/>
+      </w:pPr>
+    </w:lvl>
+  </w:abstractNum>
+  <w:abstractNum w:abstractNumId="992">
+    <w:nsid w:val="0000A992"/>
+    <w:multiLevelType w:val="multilevel"/>
+    <w:lvl w:ilvl="0">
+      <w:numFmt w:val="bullet"/>
+      <w:lvlText w:val="☐"/>
+      <w:lvlJc w:val="left"/>
+      <w:pPr>
+        <w:ind w:left="720" w:hanging="360"/>
+      </w:pPr>
+    </w:lvl>
+    <w:lvl w:ilvl="1">
+      <w:numFmt w:val="bullet"/>
+      <w:lvlText w:val="☐"/>
+      <w:lvlJc w:val="left"/>
+      <w:pPr>
+        <w:ind w:left="1440" w:hanging="360"/>
+      </w:pPr>
+    </w:lvl>
+    <w:lvl w:ilvl="2">
+      <w:numFmt w:val="bullet"/>
+      <w:lvlText w:val="☐"/>
+      <w:lvlJc w:val="left"/>
+      <w:pPr>
+        <w:ind w:left="2160" w:hanging="360"/>
+      </w:pPr>
+    </w:lvl>
+    <w:lvl w:ilvl="3">
+      <w:numFmt w:val="bullet"/>
+      <w:lvlText w:val="☐"/>
+      <w:lvlJc w:val="left"/>
+      <w:pPr>
+        <w:ind w:left="2880" w:hanging="360"/>
+      </w:pPr>
+    </w:lvl>
+    <w:lvl w:ilvl="4">
+      <w:numFmt w:val="bullet"/>
+      <w:lvlText w:val="☐"/>
+      <w:lvlJc w:val="left"/>
+      <w:pPr>
+        <w:ind w:left="3600" w:hanging="360"/>
+      </w:pPr>
+    </w:lvl>
+    <w:lvl w:ilvl="5">
+      <w:numFmt w:val="bullet"/>
+      <w:lvlText w:val="☐"/>
+      <w:lvlJc w:val="left"/>
+      <w:pPr>
+        <w:ind w:left="4320" w:hanging="360"/>
+      </w:pPr>
+    </w:lvl>
+    <w:lvl w:ilvl="6">
+      <w:numFmt w:val="bullet"/>
+      <w:lvlText w:val="☐"/>
+      <w:lvlJc w:val="left"/>
+      <w:pPr>
+        <w:ind w:left="5040" w:hanging="360"/>
+      </w:pPr>
+    </w:lvl>
+    <w:lvl w:ilvl="7">
+      <w:numFmt w:val="bullet"/>
+      <w:lvlText w:val="☐"/>
+      <w:lvlJc w:val="left"/>
+      <w:pPr>
+        <w:ind w:left="5760" w:hanging="360"/>
+      </w:pPr>
+    </w:lvl>
+    <w:lvl w:ilvl="8">
+      <w:numFmt w:val="bullet"/>
+      <w:lvlText w:val="☐"/>
       <w:lvlJc w:val="left"/>
       <w:pPr>
         <w:ind w:left="6480" w:hanging="360"/>
@@ -5633,18 +6107,30 @@
     <w:abstractNumId w:val="991"/>
   </w:num>
   <w:num w:numId="1006">
+    <w:abstractNumId w:val="993"/>
+  </w:num>
+  <w:num w:numId="1007">
+    <w:abstractNumId w:val="993"/>
+  </w:num>
+  <w:num w:numId="1008">
+    <w:abstractNumId w:val="992"/>
+  </w:num>
+  <w:num w:numId="1009">
+    <w:abstractNumId w:val="992"/>
+  </w:num>
+  <w:num w:numId="1010">
+    <w:abstractNumId w:val="992"/>
+  </w:num>
+  <w:num w:numId="1011">
     <w:abstractNumId w:val="991"/>
   </w:num>
-  <w:num w:numId="1007">
+  <w:num w:numId="1012">
     <w:abstractNumId w:val="991"/>
   </w:num>
-  <w:num w:numId="1008">
+  <w:num w:numId="1013">
     <w:abstractNumId w:val="991"/>
   </w:num>
-  <w:num w:numId="1009">
-    <w:abstractNumId w:val="991"/>
-  </w:num>
-  <w:num w:numId="1010">
+  <w:num w:numId="1014">
     <w:abstractNumId w:val="991"/>
   </w:num>
 </w:numbering>

</xml_diff>

<commit_message>
Hoftor 10-06: ESP-Seite Gruppe 2+3 verdrahtet (DI-Signale + DI-COM)
- DI-Signale verdrahtet: R17-K14->DI1 (rot, Auf), R18-K14->DI2 (rosa, Zu),
  R19-K14->DI3 (weiss-schwarz, Taster) - Funktionsfarbe durchgezogen.
- DI-Bezug: Bl-c -> COM (blau); DGND bleibt frei (isolierter Eingangs-COM
  auf 24-V-GND, DGND = Logik-Masse). Opto-Eingaenge bidirektional.
- Damit alle Feld-I/O am Waveshare dran; offen nur noch PoE ans RJ45,
  dann Flash + Kanal-/DI-Test.

Co-Authored-By: Claude Opus 4.8 <noreply@anthropic.com>
</commit_message>
<xml_diff>
--- a/Hoftor_Verdrahtung_v1.docx
+++ b/Hoftor_Verdrahtung_v1.docx
@@ -5115,7 +5115,7 @@
         <w:t xml:space="preserve">weiß-schwarz</w:t>
       </w:r>
       <w:r>
-        <w:t xml:space="preserve">) — Funktionsfarbe durchgezogen</w:t>
+        <w:t xml:space="preserve">) — verdrahtet 10-06-2026, Funktionsfarbe durchgezogen</w:t>
       </w:r>
     </w:p>
     <w:p>
@@ -5127,7 +5127,7 @@
         </w:numPr>
       </w:pPr>
       <w:r>
-        <w:t xml:space="preserve">ESP DI-COM → GND (Bl-Block, blau) — Pflicht. ⚠️ DI-Header hat</w:t>
+        <w:t xml:space="preserve">ESP DI-COM → GND — verdrahtet 10-06-2026:</w:t>
       </w:r>
       <w:r>
         <w:t xml:space="preserve"> </w:t>
@@ -5137,17 +5137,13 @@
           <w:b/>
           <w:bCs/>
         </w:rPr>
-        <w:t xml:space="preserve">COM</w:t>
-      </w:r>
-      <w:r>
-        <w:t xml:space="preserve"> </w:t>
-      </w:r>
-      <w:r>
-        <w:rPr>
-          <w:i/>
-          <w:iCs/>
-        </w:rPr>
-        <w:t xml:space="preserve">und</w:t>
+        <w:t xml:space="preserve">Bl-c → COM</w:t>
+      </w:r>
+      <w:r>
+        <w:t xml:space="preserve"> </w:t>
+      </w:r>
+      <w:r>
+        <w:t xml:space="preserve">(Blau),</w:t>
       </w:r>
       <w:r>
         <w:t xml:space="preserve"> </w:t>
@@ -5157,13 +5153,13 @@
           <w:b/>
           <w:bCs/>
         </w:rPr>
-        <w:t xml:space="preserve">DGND</w:t>
-      </w:r>
-      <w:r>
-        <w:t xml:space="preserve"> </w:t>
-      </w:r>
-      <w:r>
-        <w:t xml:space="preserve">— vor dem Auflegen klären, welcher der isolierte Eingangs-COM ist.</w:t>
+        <w:t xml:space="preserve">DGND frei</w:t>
+      </w:r>
+      <w:r>
+        <w:t xml:space="preserve"> </w:t>
+      </w:r>
+      <w:r>
+        <w:t xml:space="preserve">(isolierter Eingangs-COM auf 24-V-GND; DGND = Logik-Masse, bleibt unbeschaltet). Opto-Eingänge bidirektional → Polarität unkritisch.</w:t>
       </w:r>
     </w:p>
     <w:p>
@@ -5175,7 +5171,7 @@
         </w:numPr>
       </w:pPr>
       <w:r>
-        <w:t xml:space="preserve">PoE-Cat-Kabel an ESP-RJ45</w:t>
+        <w:t xml:space="preserve">PoE-Cat-Kabel an ESP-RJ45 (VIN frei) — danach Flash + Kanal-/DI-Test</w:t>
       </w:r>
     </w:p>
     <w:p>
@@ -6113,10 +6109,10 @@
     <w:abstractNumId w:val="993"/>
   </w:num>
   <w:num w:numId="1008">
-    <w:abstractNumId w:val="992"/>
+    <w:abstractNumId w:val="993"/>
   </w:num>
   <w:num w:numId="1009">
-    <w:abstractNumId w:val="992"/>
+    <w:abstractNumId w:val="993"/>
   </w:num>
   <w:num w:numId="1010">
     <w:abstractNumId w:val="992"/>

</xml_diff>

<commit_message>
Word-Doku auf v0.39 + Verdrahtungs-md aktualisiert
- Hoftor_Dokumentation_v0.39.docx (neu, aus Gesamtuebersicht generiert).
- Hoftor_Verdrahtung_v1.(md/docx): r2 auf CH7, 61=Ped/65=Open, Klemme 9=Blau,
  Sicherungen 2x 0,5A flink, Sicherung 28=Funk-Zweig, Hoermann DI7/DI8, Tor-Seite offen.
- 8 alte Hoftor_Dokumentation-Versionen (v0.24-v0.35) nach archive/ verschoben.
- CLAUDE.md: Doku-Verweis auf v0.39.

Co-Authored-By: Claude Opus 4.8 <noreply@anthropic.com>
</commit_message>
<xml_diff>
--- a/Hoftor_Verdrahtung_v1.docx
+++ b/Hoftor_Verdrahtung_v1.docx
@@ -2,7 +2,7 @@
 <file path=word/document.xml><?xml version="1.0" encoding="utf-8"?>
 <w:document xmlns:w="http://schemas.openxmlformats.org/wordprocessingml/2006/main" xmlns:m="http://schemas.openxmlformats.org/officeDocument/2006/math" xmlns:r="http://schemas.openxmlformats.org/officeDocument/2006/relationships" xmlns:o="urn:schemas-microsoft-com:office:office" xmlns:v="urn:schemas-microsoft-com:vml" xmlns:w10="urn:schemas-microsoft-com:office:word" xmlns:a="http://schemas.openxmlformats.org/drawingml/2006/main" xmlns:pic="http://schemas.openxmlformats.org/drawingml/2006/picture" xmlns:wp="http://schemas.openxmlformats.org/drawingml/2006/wordprocessingDrawing">
   <w:body>
-    <w:bookmarkStart w:id="24" w:name="Xe18028861d75407b2317049ef8b4ac7079fad0b"/>
+    <w:bookmarkStart w:id="25" w:name="Xe18028861d75407b2317049ef8b4ac7079fad0b"/>
     <w:p>
       <w:pPr>
         <w:pStyle w:val="Heading1"/>
@@ -14,18 +14,6 @@
     <w:p>
       <w:pPr>
         <w:pStyle w:val="FirstParagraph"/>
-      </w:pPr>
-      <w:r>
-        <w:rPr>
-          <w:b/>
-          <w:bCs/>
-        </w:rPr>
-        <w:t xml:space="preserve">Version 1.0 — Stand 03-06-2026</w:t>
-      </w:r>
-    </w:p>
-    <w:p>
-      <w:pPr>
-        <w:pStyle w:val="BodyText"/>
       </w:pPr>
       <w:r>
         <w:t xml:space="preserve">Verteiler-Innenausbau · FIBOX MCE65 36M (3×12 TE) · BFT Thalia BT A80/A160 + EBD</w:t>
@@ -71,7 +59,7 @@
         <w:rPr>
           <w:rStyle w:val="VerbatimChar"/>
         </w:rPr>
-        <w:t xml:space="preserve">Hoftor_Dokumentation_v0.35.docx</w:t>
+        <w:t xml:space="preserve">Hoftor_Dokumentation_v0.39.docx</w:t>
       </w:r>
       <w:r>
         <w:t xml:space="preserve"> </w:t>
@@ -349,28 +337,10 @@
         <w:rPr>
           <w:rStyle w:val="VerbatimChar"/>
         </w:rPr>
-        <w:t xml:space="preserve">Hoftor_Dokumentation_v0.35.docx</w:t>
+        <w:t xml:space="preserve">Hoftor_Dokumentation_v0.39.docx</w:t>
       </w:r>
       <w:r>
         <w:t xml:space="preserve">) beschrieben.</w:t>
-      </w:r>
-    </w:p>
-    <w:p>
-      <w:pPr>
-        <w:pStyle w:val="BodyText"/>
-      </w:pPr>
-      <w:r>
-        <w:rPr>
-          <w:b/>
-          <w:bCs/>
-        </w:rPr>
-        <w:t xml:space="preserve">Stand der Arbeiten (03-06-2026):</w:t>
-      </w:r>
-      <w:r>
-        <w:t xml:space="preserve"> </w:t>
-      </w:r>
-      <w:r>
-        <w:t xml:space="preserve">Der Verteiler-Innenausbau ist verdrahtet und per Foto verifiziert. Offen sind ESP-Seite, Tor-Adern (AHK-Kabel), LED-/Taster-Geräte und die 230 V-/24 V-Versorgung — siehe Abschnitt 13.</w:t>
       </w:r>
     </w:p>
     <w:bookmarkEnd w:id="10"/>
@@ -584,7 +554,7 @@
               <w:pStyle w:val="Compact"/>
             </w:pPr>
             <w:r>
-              <w:t xml:space="preserve">27 =</w:t>
+              <w:t xml:space="preserve">beide</w:t>
             </w:r>
             <w:r>
               <w:t xml:space="preserve"> </w:t>
@@ -594,10 +564,13 @@
                 <w:b/>
                 <w:bCs/>
               </w:rPr>
-              <w:t xml:space="preserve">1 A T</w:t>
-            </w:r>
-            <w:r>
-              <w:t xml:space="preserve">: PSU+ auf</w:t>
+              <w:t xml:space="preserve">2× 0,5 A flink</w:t>
+            </w:r>
+            <w:r>
+              <w:t xml:space="preserve"> </w:t>
+            </w:r>
+            <w:r>
+              <w:t xml:space="preserve">(provisorisch, träge nachrüsten). 27 = Hauptkreis: PSU+ →</w:t>
             </w:r>
             <w:r>
               <w:t xml:space="preserve"> </w:t>
@@ -636,13 +609,13 @@
                 <w:b/>
                 <w:bCs/>
               </w:rPr>
-              <w:t xml:space="preserve">+24-V-Reserve</w:t>
+              <w:t xml:space="preserve">Funk-Empfänger-Zweig</w:t>
             </w:r>
             <w:r>
               <w:t xml:space="preserve"> </w:t>
             </w:r>
             <w:r>
-              <w:t xml:space="preserve">(leer)</w:t>
+              <w:t xml:space="preserve">(Hörmann HET/S 24): PSU+ → 28-O, 28-U → Wago (+24 V)</w:t>
             </w:r>
           </w:p>
         </w:tc>
@@ -1013,7 +986,7 @@
         <w:t xml:space="preserve"> </w:t>
       </w:r>
       <w:r>
-        <w:t xml:space="preserve">sind verdrahtet,</w:t>
+        <w:t xml:space="preserve">(innen) sind verdrahtet;</w:t>
       </w:r>
       <w:r>
         <w:t xml:space="preserve"> </w:t>
@@ -1028,7 +1001,36 @@
         <w:t xml:space="preserve"> </w:t>
       </w:r>
       <w:r>
-        <w:t xml:space="preserve">(Tor-Seite) ist noch frei.</w:t>
+        <w:t xml:space="preserve">(Tor-Seite) ist</w:t>
+      </w:r>
+      <w:r>
+        <w:t xml:space="preserve"> </w:t>
+      </w:r>
+      <w:r>
+        <w:rPr>
+          <w:b/>
+          <w:bCs/>
+        </w:rPr>
+        <w:t xml:space="preserve">AHK-seitig aufgelegt (19-06, Farben bestätigt)</w:t>
+      </w:r>
+      <w:r>
+        <w:t xml:space="preserve">, aber die</w:t>
+      </w:r>
+      <w:r>
+        <w:t xml:space="preserve"> </w:t>
+      </w:r>
+      <w:r>
+        <w:rPr>
+          <w:b/>
+          <w:bCs/>
+        </w:rPr>
+        <w:t xml:space="preserve">BFT-Enden der Adern sind noch offen</w:t>
+      </w:r>
+      <w:r>
+        <w:t xml:space="preserve"> </w:t>
+      </w:r>
+      <w:r>
+        <w:t xml:space="preserve">(Berührungsschutz-WAGOs).</w:t>
       </w:r>
     </w:p>
     <w:tbl>
@@ -1181,7 +1183,7 @@
               <w:pStyle w:val="Compact"/>
             </w:pPr>
             <w:r>
-              <w:t xml:space="preserve">Open / Dauerauf</w:t>
+              <w:t xml:space="preserve">Ped / Fußgänger (Ch4)</w:t>
             </w:r>
           </w:p>
         </w:tc>
@@ -1409,7 +1411,7 @@
               <w:pStyle w:val="Compact"/>
             </w:pPr>
             <w:r>
-              <w:t xml:space="preserve">Open (Impuls)</w:t>
+              <w:t xml:space="preserve">Öffnen (Ch1)</w:t>
             </w:r>
           </w:p>
         </w:tc>
@@ -1613,7 +1615,23 @@
               <w:pStyle w:val="Compact"/>
             </w:pPr>
             <w:r>
-              <w:t xml:space="preserve">AHK (Farbe offen) → BFT 25</w:t>
+              <w:t xml:space="preserve">AHK</w:t>
+            </w:r>
+            <w:r>
+              <w:t xml:space="preserve"> </w:t>
+            </w:r>
+            <w:r>
+              <w:rPr>
+                <w:b/>
+                <w:bCs/>
+              </w:rPr>
+              <w:t xml:space="preserve">Blau</w:t>
+            </w:r>
+            <w:r>
+              <w:t xml:space="preserve"> </w:t>
+            </w:r>
+            <w:r>
+              <w:t xml:space="preserve">→ BFT 25</w:t>
             </w:r>
           </w:p>
         </w:tc>
@@ -1864,12 +1882,6 @@
               </w:rPr>
               <w:t xml:space="preserve">Grau</w:t>
             </w:r>
-            <w:r>
-              <w:t xml:space="preserve"> </w:t>
-            </w:r>
-            <w:r>
-              <w:t xml:space="preserve">✓10-06</w:t>
-            </w:r>
           </w:p>
         </w:tc>
         <w:tc>
@@ -1947,7 +1959,20 @@
               <w:pStyle w:val="Compact"/>
             </w:pPr>
             <w:r>
-              <w:t xml:space="preserve">← CH2-NO</w:t>
+              <w:t xml:space="preserve">←</w:t>
+            </w:r>
+            <w:r>
+              <w:t xml:space="preserve"> </w:t>
+            </w:r>
+            <w:r>
+              <w:rPr>
+                <w:b/>
+                <w:bCs/>
+              </w:rPr>
+              <w:t xml:space="preserve">CH7</w:t>
+            </w:r>
+            <w:r>
+              <w:t xml:space="preserve">-NO</w:t>
             </w:r>
             <w:r>
               <w:t xml:space="preserve"> </w:t>
@@ -1963,7 +1988,7 @@
               <w:t xml:space="preserve"> </w:t>
             </w:r>
             <w:r>
-              <w:t xml:space="preserve">✓10-06</w:t>
+              <w:t xml:space="preserve">(v0.38 von CH2 umgeklemmt)</w:t>
             </w:r>
           </w:p>
         </w:tc>
@@ -2054,12 +2079,6 @@
               </w:rPr>
               <w:t xml:space="preserve">Weiß</w:t>
             </w:r>
-            <w:r>
-              <w:t xml:space="preserve"> </w:t>
-            </w:r>
-            <w:r>
-              <w:t xml:space="preserve">✓10-06</w:t>
-            </w:r>
           </w:p>
         </w:tc>
         <w:tc>
@@ -2149,12 +2168,6 @@
               </w:rPr>
               <w:t xml:space="preserve">Gelb</w:t>
             </w:r>
-            <w:r>
-              <w:t xml:space="preserve"> </w:t>
-            </w:r>
-            <w:r>
-              <w:t xml:space="preserve">✓10-06</w:t>
-            </w:r>
           </w:p>
         </w:tc>
         <w:tc>
@@ -2244,12 +2257,6 @@
               </w:rPr>
               <w:t xml:space="preserve">Rot</w:t>
             </w:r>
-            <w:r>
-              <w:t xml:space="preserve"> </w:t>
-            </w:r>
-            <w:r>
-              <w:t xml:space="preserve">✓10-06</w:t>
-            </w:r>
           </w:p>
         </w:tc>
         <w:tc>
@@ -2339,12 +2346,6 @@
               </w:rPr>
               <w:t xml:space="preserve">Rot</w:t>
             </w:r>
-            <w:r>
-              <w:t xml:space="preserve"> </w:t>
-            </w:r>
-            <w:r>
-              <w:t xml:space="preserve">✓10-06</w:t>
-            </w:r>
           </w:p>
         </w:tc>
         <w:tc>
@@ -2701,16 +2702,6 @@
       <w:pPr>
         <w:pStyle w:val="FirstParagraph"/>
       </w:pPr>
-      <w:r>
-        <w:rPr>
-          <w:b/>
-          <w:bCs/>
-        </w:rPr>
-        <w:t xml:space="preserve">Verdrahtet + verifiziert (03-06-2026).</w:t>
-      </w:r>
-      <w:r>
-        <w:t xml:space="preserve"> </w:t>
-      </w:r>
       <w:r>
         <w:t xml:space="preserve">Adern auf der oberen Reihe -O/-M, untere Reihe -U bleibt frei für die Tor-Adern.</w:t>
       </w:r>
@@ -3269,16 +3260,6 @@
       <w:pPr>
         <w:pStyle w:val="FirstParagraph"/>
       </w:pPr>
-      <w:r>
-        <w:rPr>
-          <w:b/>
-          <w:bCs/>
-        </w:rPr>
-        <w:t xml:space="preserve">Verdrahtet (03-06-2026).</w:t>
-      </w:r>
-      <w:r>
-        <w:t xml:space="preserve"> </w:t>
-      </w:r>
       <w:r>
         <w:rPr>
           <w:rStyle w:val="VerbatimChar"/>
@@ -4312,7 +4293,7 @@
               <w:pStyle w:val="Compact"/>
             </w:pPr>
             <w:r>
-              <w:t xml:space="preserve">Open (Dauerauf)</w:t>
+              <w:t xml:space="preserve">Ped / Fußgänger (Ch4)</w:t>
             </w:r>
           </w:p>
         </w:tc>
@@ -4496,7 +4477,7 @@
               <w:pStyle w:val="Compact"/>
             </w:pPr>
             <w:r>
-              <w:t xml:space="preserve">Open (Impuls)</w:t>
+              <w:t xml:space="preserve">Öffnen (Ch1)</w:t>
             </w:r>
           </w:p>
         </w:tc>
@@ -4623,7 +4604,7 @@
               <w:pStyle w:val="Compact"/>
             </w:pPr>
             <w:r>
-              <w:t xml:space="preserve">(Farbe offen)</w:t>
+              <w:t xml:space="preserve">Blau</w:t>
             </w:r>
           </w:p>
         </w:tc>
@@ -4737,11 +4718,305 @@
         <w:pStyle w:val="BodyText"/>
       </w:pPr>
       <w:r>
-        <w:t xml:space="preserve">AHK-Adern vorhanden, aber noch nicht aufgelegt (Tor-Seite -U). Weiß-Schwarz ist intern für das Taster-Signal verwendet (Kl. 26 → R19-A1).</w:t>
+        <w:t xml:space="preserve">AHK-Adern auf der UV-Seite (-U)</w:t>
+      </w:r>
+      <w:r>
+        <w:t xml:space="preserve"> </w:t>
+      </w:r>
+      <w:r>
+        <w:rPr>
+          <w:b/>
+          <w:bCs/>
+        </w:rPr>
+        <w:t xml:space="preserve">aufgelegt 19-06</w:t>
+      </w:r>
+      <w:r>
+        <w:t xml:space="preserve"> </w:t>
+      </w:r>
+      <w:r>
+        <w:t xml:space="preserve">(Farben bestätigt); die</w:t>
+      </w:r>
+      <w:r>
+        <w:t xml:space="preserve"> </w:t>
+      </w:r>
+      <w:r>
+        <w:rPr>
+          <w:b/>
+          <w:bCs/>
+        </w:rPr>
+        <w:t xml:space="preserve">BFT-/Tor-Seite der Adern ist noch offen</w:t>
+      </w:r>
+      <w:r>
+        <w:t xml:space="preserve"> </w:t>
+      </w:r>
+      <w:r>
+        <w:t xml:space="preserve">(freie Enden in Berührungsschutz-WAGOs). Weiß-Schwarz ist intern für das Taster-Signal verwendet (Kl. 26 → R19-A1).</w:t>
       </w:r>
     </w:p>
     <w:bookmarkEnd w:id="20"/>
-    <w:bookmarkStart w:id="21" w:name="designprinzipien"/>
+    <w:bookmarkStart w:id="21" w:name="X8079e7a7c18e53b7c9f6082371e16a25d2cd4bc"/>
+    <w:p>
+      <w:pPr>
+        <w:pStyle w:val="Heading2"/>
+      </w:pPr>
+      <w:r>
+        <w:t xml:space="preserve">11a. Funk-Empfänger Hörmann HET/S 24 (NEU 19-06-2026)</w:t>
+      </w:r>
+    </w:p>
+    <w:p>
+      <w:pPr>
+        <w:pStyle w:val="FirstParagraph"/>
+      </w:pPr>
+      <w:r>
+        <w:t xml:space="preserve">BiSecur-Handsender → 2-Kanal-Relais-Empfänger im FIBOX, 24 V über</w:t>
+      </w:r>
+      <w:r>
+        <w:t xml:space="preserve"> </w:t>
+      </w:r>
+      <w:r>
+        <w:rPr>
+          <w:b/>
+          <w:bCs/>
+        </w:rPr>
+        <w:t xml:space="preserve">Sicherung 28</w:t>
+      </w:r>
+      <w:r>
+        <w:t xml:space="preserve"> </w:t>
+      </w:r>
+      <w:r>
+        <w:t xml:space="preserve">(eigener 4×-Wago-Verteiler). Potenzialfreier Kontakt schaltet +24 V auf einen freien DI — elektrisch identisch zum F3/F4-Status-Schema.</w:t>
+      </w:r>
+    </w:p>
+    <w:tbl>
+      <w:tblPr>
+        <w:tblStyle w:val="Table"/>
+        <w:tblW w:type="pct" w:w="5000"/>
+        <w:tblLayout w:type="fixed"/>
+        <w:tblLook w:firstRow="1" w:lastRow="0" w:firstColumn="0" w:lastColumn="0" w:noHBand="0" w:noVBand="0" w:val="0020"/>
+      </w:tblPr>
+      <w:tblGrid>
+        <w:gridCol w:w="1980"/>
+        <w:gridCol w:w="1980"/>
+        <w:gridCol w:w="1980"/>
+        <w:gridCol w:w="1980"/>
+      </w:tblGrid>
+      <w:tr>
+        <w:trPr>
+          <w:tblHeader w:val="on"/>
+        </w:trPr>
+        <w:tc>
+          <w:tcPr/>
+          <w:p>
+            <w:pPr>
+              <w:pStyle w:val="Compact"/>
+            </w:pPr>
+            <w:r>
+              <w:t xml:space="preserve">Hörmann</w:t>
+            </w:r>
+          </w:p>
+        </w:tc>
+        <w:tc>
+          <w:tcPr/>
+          <w:p>
+            <w:pPr>
+              <w:pStyle w:val="Compact"/>
+            </w:pPr>
+            <w:r>
+              <w:t xml:space="preserve">Ader</w:t>
+            </w:r>
+          </w:p>
+        </w:tc>
+        <w:tc>
+          <w:tcPr/>
+          <w:p>
+            <w:pPr>
+              <w:pStyle w:val="Compact"/>
+            </w:pPr>
+            <w:r>
+              <w:t xml:space="preserve">→ ESP-DI</w:t>
+            </w:r>
+          </w:p>
+        </w:tc>
+        <w:tc>
+          <w:tcPr/>
+          <w:p>
+            <w:pPr>
+              <w:pStyle w:val="Compact"/>
+            </w:pPr>
+            <w:r>
+              <w:t xml:space="preserve">Funktion (Logik in HA)</w:t>
+            </w:r>
+          </w:p>
+        </w:tc>
+      </w:tr>
+      <w:tr>
+        <w:tc>
+          <w:tcPr/>
+          <w:p>
+            <w:pPr>
+              <w:pStyle w:val="Compact"/>
+            </w:pPr>
+            <w:r>
+              <w:t xml:space="preserve">K1</w:t>
+            </w:r>
+          </w:p>
+        </w:tc>
+        <w:tc>
+          <w:tcPr/>
+          <w:p>
+            <w:pPr>
+              <w:pStyle w:val="Compact"/>
+            </w:pPr>
+            <w:r>
+              <w:t xml:space="preserve">Grün</w:t>
+            </w:r>
+          </w:p>
+        </w:tc>
+        <w:tc>
+          <w:tcPr/>
+          <w:p>
+            <w:pPr>
+              <w:pStyle w:val="Compact"/>
+            </w:pPr>
+            <w:r>
+              <w:rPr>
+                <w:b/>
+                <w:bCs/>
+              </w:rPr>
+              <w:t xml:space="preserve">DI7</w:t>
+            </w:r>
+            <w:r>
+              <w:t xml:space="preserve"> </w:t>
+            </w:r>
+            <w:r>
+              <w:t xml:space="preserve">(GPIO10)</w:t>
+            </w:r>
+          </w:p>
+        </w:tc>
+        <w:tc>
+          <w:tcPr/>
+          <w:p>
+            <w:pPr>
+              <w:pStyle w:val="Compact"/>
+            </w:pPr>
+            <w:r>
+              <w:rPr>
+                <w:rStyle w:val="VerbatimChar"/>
+              </w:rPr>
+              <w:t xml:space="preserve">binary_sensor.hoftor_funk_hormann_k1</w:t>
+            </w:r>
+            <w:r>
+              <w:t xml:space="preserve"> </w:t>
+            </w:r>
+            <w:r>
+              <w:t xml:space="preserve">→ Hoftor öffnen</w:t>
+            </w:r>
+          </w:p>
+        </w:tc>
+      </w:tr>
+      <w:tr>
+        <w:tc>
+          <w:tcPr/>
+          <w:p>
+            <w:pPr>
+              <w:pStyle w:val="Compact"/>
+            </w:pPr>
+            <w:r>
+              <w:t xml:space="preserve">K2</w:t>
+            </w:r>
+          </w:p>
+        </w:tc>
+        <w:tc>
+          <w:tcPr/>
+          <w:p>
+            <w:pPr>
+              <w:pStyle w:val="Compact"/>
+            </w:pPr>
+            <w:r>
+              <w:t xml:space="preserve">Gelb</w:t>
+            </w:r>
+          </w:p>
+        </w:tc>
+        <w:tc>
+          <w:tcPr/>
+          <w:p>
+            <w:pPr>
+              <w:pStyle w:val="Compact"/>
+            </w:pPr>
+            <w:r>
+              <w:rPr>
+                <w:b/>
+                <w:bCs/>
+              </w:rPr>
+              <w:t xml:space="preserve">DI8</w:t>
+            </w:r>
+            <w:r>
+              <w:t xml:space="preserve"> </w:t>
+            </w:r>
+            <w:r>
+              <w:t xml:space="preserve">(GPIO11)</w:t>
+            </w:r>
+          </w:p>
+        </w:tc>
+        <w:tc>
+          <w:tcPr/>
+          <w:p>
+            <w:pPr>
+              <w:pStyle w:val="Compact"/>
+            </w:pPr>
+            <w:r>
+              <w:rPr>
+                <w:rStyle w:val="VerbatimChar"/>
+              </w:rPr>
+              <w:t xml:space="preserve">binary_sensor.hoftor_funk_hormann_k2</w:t>
+            </w:r>
+            <w:r>
+              <w:t xml:space="preserve"> </w:t>
+            </w:r>
+            <w:r>
+              <w:t xml:space="preserve">→ Hoflicht (Shelly)</w:t>
+            </w:r>
+          </w:p>
+        </w:tc>
+      </w:tr>
+    </w:tbl>
+    <w:p>
+      <w:pPr>
+        <w:pStyle w:val="BodyText"/>
+      </w:pPr>
+      <w:r>
+        <w:t xml:space="preserve">Verdrahtung: Empfänger V+ ← +24 V (Wago, über Sicherung 28) · V− ← GND · beide Relais-COMs ← +24 V (Wago) · NO K1 → DI7 · NO K2 → DI8. Reine Melder (kein</w:t>
+      </w:r>
+      <w:r>
+        <w:t xml:space="preserve"> </w:t>
+      </w:r>
+      <w:r>
+        <w:rPr>
+          <w:rStyle w:val="VerbatimChar"/>
+        </w:rPr>
+        <w:t xml:space="preserve">on_press</w:t>
+      </w:r>
+      <w:r>
+        <w:t xml:space="preserve"> </w:t>
+      </w:r>
+      <w:r>
+        <w:t xml:space="preserve">in der Firmware), Schalt-Logik in HA. Details:</w:t>
+      </w:r>
+      <w:r>
+        <w:t xml:space="preserve"> </w:t>
+      </w:r>
+      <w:r>
+        <w:rPr>
+          <w:rStyle w:val="VerbatimChar"/>
+        </w:rPr>
+        <w:t xml:space="preserve">Hoftor_Hoermann_Funkempfaenger_Uebergabe.md</w:t>
+      </w:r>
+      <w:r>
+        <w:t xml:space="preserve">.</w:t>
+      </w:r>
+    </w:p>
+    <w:bookmarkEnd w:id="21"/>
+    <w:bookmarkStart w:id="22" w:name="designprinzipien"/>
     <w:p>
       <w:pPr>
         <w:pStyle w:val="Heading2"/>
@@ -4876,8 +5151,8 @@
         <w:t xml:space="preserve">— der Rückleiter muss als Referenz immer durchverbunden bleiben.</w:t>
       </w:r>
     </w:p>
-    <w:bookmarkEnd w:id="21"/>
-    <w:bookmarkStart w:id="22" w:name="Xcd06cc067264985d2c46afa0d09e902caf4562e"/>
+    <w:bookmarkEnd w:id="22"/>
+    <w:bookmarkStart w:id="23" w:name="Xcd06cc067264985d2c46afa0d09e902caf4562e"/>
     <w:p>
       <w:pPr>
         <w:pStyle w:val="Heading2"/>
@@ -4933,13 +5208,13 @@
           <w:b/>
           <w:bCs/>
         </w:rPr>
-        <w:t xml:space="preserve">Onboard-Relais-COMs CH1–CH6 ← +24 V (R-Block, rot)</w:t>
-      </w:r>
-      <w:r>
-        <w:t xml:space="preserve"> </w:t>
-      </w:r>
-      <w:r>
-        <w:t xml:space="preserve">— verdrahtet 10-06-2026: CH1←R-c · CH2←R-e · CH3←R-g · CH4←R-i · CH5←R-k · CH6←R-m</w:t>
+        <w:t xml:space="preserve">Onboard-Relais-COMs CH1–CH6 ← +24 V (R-Block, rot):</w:t>
+      </w:r>
+      <w:r>
+        <w:t xml:space="preserve"> </w:t>
+      </w:r>
+      <w:r>
+        <w:t xml:space="preserve">CH1←R-c · CH2←R-e · CH3←R-g · CH4←R-i · CH5←R-k · CH6←R-m</w:t>
       </w:r>
     </w:p>
     <w:p>
@@ -4955,13 +5230,7 @@
           <w:b/>
           <w:bCs/>
         </w:rPr>
-        <w:t xml:space="preserve">NO CH1–CH6 → A1 von R11–R16</w:t>
-      </w:r>
-      <w:r>
-        <w:t xml:space="preserve"> </w:t>
-      </w:r>
-      <w:r>
-        <w:t xml:space="preserve">— verdrahtet 10-06-2026.</w:t>
+        <w:t xml:space="preserve">NO CH1–CH6 → A1 von R11–R16.</w:t>
       </w:r>
       <w:r>
         <w:t xml:space="preserve"> </w:t>
@@ -4977,7 +5246,7 @@
         <w:t xml:space="preserve"> </w:t>
       </w:r>
       <w:r>
-        <w:t xml:space="preserve">(durchgängig BFT→Waveshare; ersetzt frühere „schwarz”-Festlegung, da Schwarz = COM-Haupt): R11</w:t>
+        <w:t xml:space="preserve">(durchgängig BFT→Waveshare; Schwarz = COM-Haupt, daher NICHT Antrieb): R11</w:t>
       </w:r>
       <w:r>
         <w:t xml:space="preserve"> </w:t>
@@ -5115,7 +5384,7 @@
         <w:t xml:space="preserve">weiß-schwarz</w:t>
       </w:r>
       <w:r>
-        <w:t xml:space="preserve">) — verdrahtet 10-06-2026, Funktionsfarbe durchgezogen</w:t>
+        <w:t xml:space="preserve">) — Funktionsfarbe durchgezogen</w:t>
       </w:r>
     </w:p>
     <w:p>
@@ -5127,7 +5396,7 @@
         </w:numPr>
       </w:pPr>
       <w:r>
-        <w:t xml:space="preserve">ESP DI-COM → GND — verdrahtet 10-06-2026:</w:t>
+        <w:t xml:space="preserve">ESP DI-COM → GND:</w:t>
       </w:r>
       <w:r>
         <w:t xml:space="preserve"> </w:t>
@@ -5313,7 +5582,7 @@
         </w:numPr>
       </w:pPr>
       <w:r>
-        <w:t xml:space="preserve">☒ 230 V L/N/PE (Block B) einführen →</w:t>
+        <w:t xml:space="preserve">230 V L/N/PE (Block B) einführen →</w:t>
       </w:r>
       <w:r>
         <w:t xml:space="preserve"> </w:t>
@@ -5329,184 +5598,7 @@
         <w:t xml:space="preserve"> </w:t>
       </w:r>
       <w:r>
-        <w:t xml:space="preserve">(2-pol., 25 A) → PSU-Eingang (10-06-2026)</w:t>
-      </w:r>
-    </w:p>
-    <w:p>
-      <w:pPr>
-        <w:pStyle w:val="Compact"/>
-        <w:numPr>
-          <w:ilvl w:val="0"/>
-          <w:numId w:val="1013"/>
-        </w:numPr>
-      </w:pPr>
-      <w:r>
-        <w:t xml:space="preserve">☒ 24-V-Netzteil</w:t>
-      </w:r>
-      <w:r>
-        <w:t xml:space="preserve"> </w:t>
-      </w:r>
-      <w:r>
-        <w:rPr>
-          <w:b/>
-          <w:bCs/>
-        </w:rPr>
-        <w:t xml:space="preserve">Phoenix STEP POWER 1088495</w:t>
-      </w:r>
-      <w:r>
-        <w:t xml:space="preserve"> </w:t>
-      </w:r>
-      <w:r>
-        <w:t xml:space="preserve">(24 V/0,63 A) auf Hutschiene (Reihe 1) — ESP hängt per PoE NICHT am PSU — verbaut 10-06-2026</w:t>
-      </w:r>
-    </w:p>
-    <w:p>
-      <w:pPr>
-        <w:pStyle w:val="Compact"/>
-        <w:numPr>
-          <w:ilvl w:val="0"/>
-          <w:numId w:val="1013"/>
-        </w:numPr>
-      </w:pPr>
-      <w:r>
-        <w:t xml:space="preserve">☒</w:t>
-      </w:r>
-      <w:r>
-        <w:t xml:space="preserve"> </w:t>
-      </w:r>
-      <w:r>
-        <w:rPr>
-          <w:b/>
-          <w:bCs/>
-        </w:rPr>
-        <w:t xml:space="preserve">27-U → R-a</w:t>
-      </w:r>
-      <w:r>
-        <w:t xml:space="preserve"> </w:t>
-      </w:r>
-      <w:r>
-        <w:t xml:space="preserve">verdrahtet (Rot 0,5 mm²) ·</w:t>
-      </w:r>
-      <w:r>
-        <w:t xml:space="preserve"> </w:t>
-      </w:r>
-      <w:r>
-        <w:rPr>
-          <w:b/>
-          <w:bCs/>
-        </w:rPr>
-        <w:t xml:space="preserve">PSU+ → 27-O</w:t>
-      </w:r>
-      <w:r>
-        <w:t xml:space="preserve"> </w:t>
-      </w:r>
-      <w:r>
-        <w:t xml:space="preserve">verdrahtet 10-06-2026. ⚠️</w:t>
-      </w:r>
-      <w:r>
-        <w:t xml:space="preserve"> </w:t>
-      </w:r>
-      <w:r>
-        <w:rPr>
-          <w:b/>
-          <w:bCs/>
-        </w:rPr>
-        <w:t xml:space="preserve">Glassicherung 1 A T noch bestätigen, ob gesteckt</w:t>
-      </w:r>
-      <w:r>
-        <w:t xml:space="preserve"> </w:t>
-      </w:r>
-      <w:r>
-        <w:t xml:space="preserve">(Plan: erst bei Inbetriebnahme → +24-V-Kreis bleibt beim Aufbau spannungslos). Polarität egal — antiparallele LED in der HESILED.</w:t>
-      </w:r>
-    </w:p>
-    <w:p>
-      <w:pPr>
-        <w:pStyle w:val="Compact"/>
-        <w:numPr>
-          <w:ilvl w:val="0"/>
-          <w:numId w:val="1013"/>
-        </w:numPr>
-      </w:pPr>
-      <w:r>
-        <w:t xml:space="preserve">☒</w:t>
-      </w:r>
-      <w:r>
-        <w:t xml:space="preserve"> </w:t>
-      </w:r>
-      <w:r>
-        <w:rPr>
-          <w:b/>
-          <w:bCs/>
-        </w:rPr>
-        <w:t xml:space="preserve">PSU− → Bl-a</w:t>
-      </w:r>
-      <w:r>
-        <w:t xml:space="preserve"> </w:t>
-      </w:r>
-      <w:r>
-        <w:t xml:space="preserve">(GND,</w:t>
-      </w:r>
-      <w:r>
-        <w:t xml:space="preserve"> </w:t>
-      </w:r>
-      <w:r>
-        <w:rPr>
-          <w:b/>
-          <w:bCs/>
-        </w:rPr>
-        <w:t xml:space="preserve">ungesichert</w:t>
-      </w:r>
-      <w:r>
-        <w:t xml:space="preserve"> </w:t>
-      </w:r>
-      <w:r>
-        <w:t xml:space="preserve">— 0-V-Rückleiter nie absichern) — verdrahtet 10-06-2026</w:t>
-      </w:r>
-    </w:p>
-    <w:p>
-      <w:pPr>
-        <w:pStyle w:val="Compact"/>
-        <w:numPr>
-          <w:ilvl w:val="0"/>
-          <w:numId w:val="1013"/>
-        </w:numPr>
-      </w:pPr>
-      <w:r>
-        <w:t xml:space="preserve">Sicherung 28 =</w:t>
-      </w:r>
-      <w:r>
-        <w:t xml:space="preserve"> </w:t>
-      </w:r>
-      <w:r>
-        <w:rPr>
-          <w:b/>
-          <w:bCs/>
-        </w:rPr>
-        <w:t xml:space="preserve">+24-V-Reserve</w:t>
-      </w:r>
-      <w:r>
-        <w:t xml:space="preserve"> </w:t>
-      </w:r>
-      <w:r>
-        <w:t xml:space="preserve">(leer)</w:t>
-      </w:r>
-    </w:p>
-    <w:p>
-      <w:r>
-        <w:pict>
-          <v:rect style="width:0;height:1.5pt" o:hralign="center" o:hrstd="t" o:hr="t"/>
-        </w:pict>
-      </w:r>
-    </w:p>
-    <w:bookmarkEnd w:id="22"/>
-    <w:bookmarkStart w:id="23" w:name="querverweise"/>
-    <w:p>
-      <w:pPr>
-        <w:pStyle w:val="Heading2"/>
-      </w:pPr>
-      <w:r>
-        <w:t xml:space="preserve">14. Querverweise</w:t>
+        <w:t xml:space="preserve">(2-pol., 25 A) → PSU-Eingang</w:t>
       </w:r>
     </w:p>
     <w:p>
@@ -5518,20 +5610,23 @@
         </w:numPr>
       </w:pPr>
       <w:r>
+        <w:t xml:space="preserve">24-V-Netzteil</w:t>
+      </w:r>
+      <w:r>
+        <w:t xml:space="preserve"> </w:t>
+      </w:r>
+      <w:r>
         <w:rPr>
           <w:b/>
           <w:bCs/>
         </w:rPr>
-        <w:t xml:space="preserve">Firmware-/Software-Logik (ESPHome):</w:t>
-      </w:r>
-      <w:r>
-        <w:t xml:space="preserve"> </w:t>
-      </w:r>
-      <w:r>
-        <w:rPr>
-          <w:rStyle w:val="VerbatimChar"/>
-        </w:rPr>
-        <w:t xml:space="preserve">Hoftor_Dokumentation_v0.35.docx</w:t>
+        <w:t xml:space="preserve">Phoenix STEP POWER 1088495</w:t>
+      </w:r>
+      <w:r>
+        <w:t xml:space="preserve"> </w:t>
+      </w:r>
+      <w:r>
+        <w:t xml:space="preserve">(24 V/0,63 A) auf Hutschiene (Reihe 1) — ESP hängt per PoE NICHT am PSU</w:t>
       </w:r>
     </w:p>
     <w:p>
@@ -5539,7 +5634,7 @@
         <w:pStyle w:val="Compact"/>
         <w:numPr>
           <w:ilvl w:val="0"/>
-          <w:numId w:val="1014"/>
+          <w:numId w:val="1015"/>
         </w:numPr>
       </w:pPr>
       <w:r>
@@ -5547,31 +5642,42 @@
           <w:b/>
           <w:bCs/>
         </w:rPr>
-        <w:t xml:space="preserve">Live-Arbeitsdoku / vollständiger Stand:</w:t>
-      </w:r>
-      <w:r>
-        <w:t xml:space="preserve"> </w:t>
-      </w:r>
-      <w:r>
-        <w:rPr>
-          <w:rStyle w:val="VerbatimChar"/>
-        </w:rPr>
-        <w:t xml:space="preserve">CLAUDE.md</w:t>
-      </w:r>
-      <w:r>
-        <w:t xml:space="preserve"> </w:t>
-      </w:r>
-      <w:r>
-        <w:t xml:space="preserve">(</w:t>
-      </w:r>
-      <w:r>
-        <w:rPr>
-          <w:rStyle w:val="VerbatimChar"/>
-        </w:rPr>
-        <w:t xml:space="preserve">hw-hoftor</w:t>
-      </w:r>
-      <w:r>
-        <w:t xml:space="preserve">, Abschnitt §6a)</w:t>
+        <w:t xml:space="preserve">27-U → R-a</w:t>
+      </w:r>
+      <w:r>
+        <w:t xml:space="preserve"> </w:t>
+      </w:r>
+      <w:r>
+        <w:t xml:space="preserve">(Rot 0,5 mm²) ·</w:t>
+      </w:r>
+      <w:r>
+        <w:t xml:space="preserve"> </w:t>
+      </w:r>
+      <w:r>
+        <w:rPr>
+          <w:b/>
+          <w:bCs/>
+        </w:rPr>
+        <w:t xml:space="preserve">PSU+ → 27-O</w:t>
+      </w:r>
+      <w:r>
+        <w:t xml:space="preserve">.</w:t>
+      </w:r>
+      <w:r>
+        <w:t xml:space="preserve"> </w:t>
+      </w:r>
+      <w:r>
+        <w:rPr>
+          <w:b/>
+          <w:bCs/>
+        </w:rPr>
+        <w:t xml:space="preserve">Sicherungen gesteckt 19-06: 2× 0,5 A flink</w:t>
+      </w:r>
+      <w:r>
+        <w:t xml:space="preserve"> </w:t>
+      </w:r>
+      <w:r>
+        <w:t xml:space="preserve">(provisorisch, träge nachrüsten). Polarität egal — antiparallele LED in der HESILED.</w:t>
       </w:r>
     </w:p>
     <w:p>
@@ -5579,7 +5685,7 @@
         <w:pStyle w:val="Compact"/>
         <w:numPr>
           <w:ilvl w:val="0"/>
-          <w:numId w:val="1014"/>
+          <w:numId w:val="1016"/>
         </w:numPr>
       </w:pPr>
       <w:r>
@@ -5587,6 +5693,154 @@
           <w:b/>
           <w:bCs/>
         </w:rPr>
+        <w:t xml:space="preserve">PSU− → Bl-a</w:t>
+      </w:r>
+      <w:r>
+        <w:t xml:space="preserve"> </w:t>
+      </w:r>
+      <w:r>
+        <w:t xml:space="preserve">(GND,</w:t>
+      </w:r>
+      <w:r>
+        <w:t xml:space="preserve"> </w:t>
+      </w:r>
+      <w:r>
+        <w:rPr>
+          <w:b/>
+          <w:bCs/>
+        </w:rPr>
+        <w:t xml:space="preserve">ungesichert</w:t>
+      </w:r>
+      <w:r>
+        <w:t xml:space="preserve"> </w:t>
+      </w:r>
+      <w:r>
+        <w:t xml:space="preserve">— 0-V-Rückleiter nie absichern)</w:t>
+      </w:r>
+    </w:p>
+    <w:p>
+      <w:pPr>
+        <w:pStyle w:val="Compact"/>
+        <w:numPr>
+          <w:ilvl w:val="0"/>
+          <w:numId w:val="1017"/>
+        </w:numPr>
+      </w:pPr>
+      <w:r>
+        <w:t xml:space="preserve">Sicherung 28 =</w:t>
+      </w:r>
+      <w:r>
+        <w:t xml:space="preserve"> </w:t>
+      </w:r>
+      <w:r>
+        <w:rPr>
+          <w:b/>
+          <w:bCs/>
+        </w:rPr>
+        <w:t xml:space="preserve">Funk-Empfänger-Zweig</w:t>
+      </w:r>
+      <w:r>
+        <w:t xml:space="preserve"> </w:t>
+      </w:r>
+      <w:r>
+        <w:t xml:space="preserve">(Hörmann HET/S 24): PSU+ → 28-O, 28-U → Wago (+24 V)</w:t>
+      </w:r>
+    </w:p>
+    <w:p>
+      <w:r>
+        <w:pict>
+          <v:rect style="width:0;height:1.5pt" o:hralign="center" o:hrstd="t" o:hr="t"/>
+        </w:pict>
+      </w:r>
+    </w:p>
+    <w:bookmarkEnd w:id="23"/>
+    <w:bookmarkStart w:id="24" w:name="querverweise"/>
+    <w:p>
+      <w:pPr>
+        <w:pStyle w:val="Heading2"/>
+      </w:pPr>
+      <w:r>
+        <w:t xml:space="preserve">14. Querverweise</w:t>
+      </w:r>
+    </w:p>
+    <w:p>
+      <w:pPr>
+        <w:pStyle w:val="Compact"/>
+        <w:numPr>
+          <w:ilvl w:val="0"/>
+          <w:numId w:val="1018"/>
+        </w:numPr>
+      </w:pPr>
+      <w:r>
+        <w:rPr>
+          <w:b/>
+          <w:bCs/>
+        </w:rPr>
+        <w:t xml:space="preserve">Firmware-/Software-Logik (ESPHome):</w:t>
+      </w:r>
+      <w:r>
+        <w:t xml:space="preserve"> </w:t>
+      </w:r>
+      <w:r>
+        <w:rPr>
+          <w:rStyle w:val="VerbatimChar"/>
+        </w:rPr>
+        <w:t xml:space="preserve">Hoftor_Dokumentation_v0.39.docx</w:t>
+      </w:r>
+    </w:p>
+    <w:p>
+      <w:pPr>
+        <w:pStyle w:val="Compact"/>
+        <w:numPr>
+          <w:ilvl w:val="0"/>
+          <w:numId w:val="1018"/>
+        </w:numPr>
+      </w:pPr>
+      <w:r>
+        <w:rPr>
+          <w:b/>
+          <w:bCs/>
+        </w:rPr>
+        <w:t xml:space="preserve">Live-Arbeitsdoku / vollständiger Stand:</w:t>
+      </w:r>
+      <w:r>
+        <w:t xml:space="preserve"> </w:t>
+      </w:r>
+      <w:r>
+        <w:rPr>
+          <w:rStyle w:val="VerbatimChar"/>
+        </w:rPr>
+        <w:t xml:space="preserve">CLAUDE.md</w:t>
+      </w:r>
+      <w:r>
+        <w:t xml:space="preserve"> </w:t>
+      </w:r>
+      <w:r>
+        <w:t xml:space="preserve">(</w:t>
+      </w:r>
+      <w:r>
+        <w:rPr>
+          <w:rStyle w:val="VerbatimChar"/>
+        </w:rPr>
+        <w:t xml:space="preserve">hw-hoftor</w:t>
+      </w:r>
+      <w:r>
+        <w:t xml:space="preserve">, Abschnitt §6a)</w:t>
+      </w:r>
+    </w:p>
+    <w:p>
+      <w:pPr>
+        <w:pStyle w:val="Compact"/>
+        <w:numPr>
+          <w:ilvl w:val="0"/>
+          <w:numId w:val="1018"/>
+        </w:numPr>
+      </w:pPr>
+      <w:r>
+        <w:rPr>
+          <w:b/>
+          <w:bCs/>
+        </w:rPr>
         <w:t xml:space="preserve">BFT-Handbuch:</w:t>
       </w:r>
       <w:r>
@@ -5605,8 +5859,8 @@
         <w:t xml:space="preserve">(im Repo)</w:t>
       </w:r>
     </w:p>
-    <w:bookmarkEnd w:id="23"/>
     <w:bookmarkEnd w:id="24"/>
+    <w:bookmarkEnd w:id="25"/>
     <w:sectPr>
       <w:footnotePr>
         <w:numRestart w:val="eachSect"/>
@@ -6124,9 +6378,21 @@
     <w:abstractNumId w:val="991"/>
   </w:num>
   <w:num w:numId="1013">
-    <w:abstractNumId w:val="991"/>
+    <w:abstractNumId w:val="993"/>
   </w:num>
   <w:num w:numId="1014">
+    <w:abstractNumId w:val="993"/>
+  </w:num>
+  <w:num w:numId="1015">
+    <w:abstractNumId w:val="993"/>
+  </w:num>
+  <w:num w:numId="1016">
+    <w:abstractNumId w:val="993"/>
+  </w:num>
+  <w:num w:numId="1017">
+    <w:abstractNumId w:val="993"/>
+  </w:num>
+  <w:num w:numId="1018">
     <w:abstractNumId w:val="991"/>
   </w:num>
 </w:numbering>

</xml_diff>

<commit_message>
Restliche Stand-Fixes: BEDIENUNG/CLAUDE/Verdrahtung auf v0.39
- BEDIENUNG.md: YAML v0.39, DI7/DI8 = Funk Hoermann (DI-Tabelle + Kurzreferenz), r2 auf CH7.
- CLAUDE.md: §5 Klemme 2/BFT61 = Ped (war Open); Reserve = DI4-DI6.
- Hoftor_Verdrahtung_v1.(md/docx): Sicherung 27 = 0,5 A flink.

Co-Authored-By: Claude Opus 4.8 <noreply@anthropic.com>
</commit_message>
<xml_diff>
--- a/Hoftor_Verdrahtung_v1.docx
+++ b/Hoftor_Verdrahtung_v1.docx
@@ -5132,7 +5132,23 @@
         <w:t xml:space="preserve"> </w:t>
       </w:r>
       <w:r>
-        <w:t xml:space="preserve">Sicherung 27 (1 A T) in der +24-V-Einspeisung (HESILED mit antiparalleler LED → Einspeiseseite/Polarität egal).</w:t>
+        <w:t xml:space="preserve">Sicherung 27 (aktuell</w:t>
+      </w:r>
+      <w:r>
+        <w:t xml:space="preserve"> </w:t>
+      </w:r>
+      <w:r>
+        <w:rPr>
+          <w:b/>
+          <w:bCs/>
+        </w:rPr>
+        <w:t xml:space="preserve">0,5 A flink</w:t>
+      </w:r>
+      <w:r>
+        <w:t xml:space="preserve"> </w:t>
+      </w:r>
+      <w:r>
+        <w:t xml:space="preserve">provisorisch; Soll 0,5 A träge) in der +24-V-Einspeisung (HESILED mit antiparalleler LED → Einspeiseseite/Polarität egal).</w:t>
       </w:r>
       <w:r>
         <w:t xml:space="preserve"> </w:t>

</xml_diff>